<commit_message>
Update PR2 and PR3 reports from verified Vivado results
</commit_message>
<xml_diff>
--- a/report/Отчет_ПР1_ПР2_ПР3_Рябец_Головин_Гришин.docx
+++ b/report/Отчет_ПР1_ПР2_ПР3_Рябец_Головин_Гришин.docx
@@ -263,7 +263,7 @@
           <w:sz w:val="26"/>
           <w:szCs w:val="26"/>
         </w:rPr>
-        <w:t>Тема: Программная модель, RTL-модель и прототип нейросетевого классификатора падений на ПЛИС</w:t>
+        <w:t>Тема: Программная модель, RTL-модель и прототип классификатора падений на ПЛИС</w:t>
       </w:r>
     </w:p>
     <w:p>
@@ -654,7 +654,7 @@
         <w:rPr/>
         <w:t>1 ПОСТАНОВКА ЗАДАЧИ И ДАТАСЕТ SISFALL</w:t>
         <w:tab/>
-        <w:t>5</w:t>
+        <w:t>4</w:t>
       </w:r>
     </w:p>
     <w:p>
@@ -670,7 +670,7 @@
         <w:rPr/>
         <w:t>2 ИЗВЛЕЧЕНИЕ ПРИЗНАКОВ И ФОРМИРОВАНИЕ ВЫБОРОК</w:t>
         <w:tab/>
-        <w:t>6</w:t>
+        <w:t>5</w:t>
       </w:r>
     </w:p>
     <w:p>
@@ -686,7 +686,7 @@
         <w:rPr/>
         <w:t>3 АРХИТЕКТУРА СЕТИ И КВАНТОВАНИЕ</w:t>
         <w:tab/>
-        <w:t>8</w:t>
+        <w:t>7</w:t>
       </w:r>
     </w:p>
     <w:p>
@@ -702,7 +702,7 @@
         <w:rPr/>
         <w:t>4 ОБУЧЕНИЕ И ПРОГРАММНАЯ РЕАЛИЗАЦИЯ</w:t>
         <w:tab/>
-        <w:t>10</w:t>
+        <w:t>8</w:t>
       </w:r>
     </w:p>
     <w:p>
@@ -718,7 +718,7 @@
         <w:rPr/>
         <w:t>5 РЕЗУЛЬТАТЫ И ЭТАЛОННЫЙ ОТКЛИК</w:t>
         <w:tab/>
-        <w:t>12</w:t>
+        <w:t>9</w:t>
       </w:r>
     </w:p>
     <w:p>
@@ -733,7 +733,7 @@
       <w:r>
         <w:t>6 ПОСТАНОВКА ЗАДАЧИ ПРАКТИЧЕСКОЙ РАБОТЫ № 2</w:t>
         <w:tab/>
-        <w:t>15</w:t>
+        <w:t>11</w:t>
       </w:r>
     </w:p>
     <w:p>
@@ -748,7 +748,7 @@
       <w:r>
         <w:t>7 РЕАЛИЗАЦИЯ RTL-МОДЕЛИ</w:t>
         <w:tab/>
-        <w:t>17</w:t>
+        <w:t>12</w:t>
       </w:r>
     </w:p>
     <w:p>
@@ -763,7 +763,7 @@
       <w:r>
         <w:t>8 СИМУЛЯЦИЯ И СВЕРКА С ЭТАЛОНОМ</w:t>
         <w:tab/>
-        <w:t>18</w:t>
+        <w:t>13</w:t>
       </w:r>
     </w:p>
     <w:p>
@@ -776,9 +776,9 @@
         <w:rPr/>
       </w:pPr>
       <w:r>
-        <w:t>9 ПРОТОТИП НА ПЛИС</w:t>
+        <w:t>9 ПРОТОТИП И КОНВЕЙЕРНАЯ АРХИТЕКТУРА</w:t>
         <w:tab/>
-        <w:t>21</w:t>
+        <w:t>14</w:t>
       </w:r>
     </w:p>
     <w:p>
@@ -791,9 +791,9 @@
         <w:rPr/>
       </w:pPr>
       <w:r>
-        <w:t>10 СИМУЛЯЦИЯ И РЕЗУЛЬТАТЫ РЕАЛИЗАЦИИ</w:t>
+        <w:t>10 ПРОВЕРКА И РЕЗУЛЬТАТЫ РЕАЛИЗАЦИИ</w:t>
         <w:tab/>
-        <w:t>24</w:t>
+        <w:t>16</w:t>
       </w:r>
     </w:p>
     <w:p>
@@ -809,7 +809,7 @@
         <w:rPr/>
         <w:t>ЗАКЛЮЧЕНИЕ</w:t>
         <w:tab/>
-        <w:t>26</w:t>
+        <w:t>19</w:t>
       </w:r>
     </w:p>
     <w:p>
@@ -825,7 +825,7 @@
         <w:rPr/>
         <w:t>СПИСОК ИСПОЛЬЗОВАННЫХ ИСТОЧНИКОВ</w:t>
         <w:tab/>
-        <w:t>27</w:t>
+        <w:t>20</w:t>
       </w:r>
     </w:p>
     <w:p>
@@ -841,7 +841,7 @@
         <w:rPr/>
         <w:t>ПРИЛОЖЕНИЕ А КЛЮЧЕВЫЕ ФРАГМЕНТЫ ПРОГРАММЫ</w:t>
         <w:tab/>
-        <w:t>28</w:t>
+        <w:t>21</w:t>
       </w:r>
     </w:p>
     <w:p>
@@ -856,7 +856,7 @@
       <w:r>
         <w:t>ПРИЛОЖЕНИЕ Б ИСХОДНЫЙ КОД RTL-МОДЕЛИ</w:t>
         <w:tab/>
-        <w:t>33</w:t>
+        <w:t>26</w:t>
       </w:r>
     </w:p>
     <w:p>
@@ -869,9 +869,9 @@
         <w:rPr/>
       </w:pPr>
       <w:r>
-        <w:t>ПРИЛОЖЕНИЕ В КОД ПРОТОТИПА И ОГРАНИЧЕНИЕ</w:t>
+        <w:t>ПРИЛОЖЕНИЕ В КОД ПРОТОТИПА И КОНВЕЙЕРА</w:t>
         <w:tab/>
-        <w:t>36</w:t>
+        <w:t>29</w:t>
       </w:r>
     </w:p>
     <w:p>
@@ -901,7 +901,7 @@
       </w:pPr>
       <w:r>
         <w:rPr/>
-        <w:t>Цель практических работ № 1–3 — построить программную эталонную модель нейроускорителя, разработать её RTL-эквивалент на Verilog, проверить совпадение вычислений в симуляции и реализовать прототип классификатора для выбранного кристалла ПЛИС. Модель обрабатывает подготовленные признаки движения и выдаёт один бит решения.</w:t>
+        <w:t>Цель работы — разработать программный эталон классификатора падений, реализовать его на Verilog, проверить совпадение результатов и получить прототип для ПЛИС. После функциональной проверки исследуется влияние регистра между слоями на временные характеристики и использование ресурсов.</w:t>
       </w:r>
     </w:p>
     <w:p>
@@ -1020,7 +1020,7 @@
         <w:pStyle w:val="ReportBody"/>
       </w:pPr>
       <w:r>
-        <w:t>– создать верхний модуль прототипа с контрольным набором, проверить его работу симуляцией и выполнить размещение и трассировку в Vivado;</w:t>
+        <w:t>– проверить верхний модуль с контрольными данными и выполнить размещение и трассировку;</w:t>
       </w:r>
     </w:p>
     <w:p>
@@ -1028,12 +1028,14 @@
         <w:pStyle w:val="ReportBody"/>
       </w:pPr>
       <w:r>
-        <w:t>– оценить использование ресурсов, результат трассировки и временные характеристики для выбранного кристалла.</w:t>
+        <w:t>– сравнить исходный и конвейерный вычислительные тракты при одинаковых входах и ограничениях.</w:t>
       </w:r>
     </w:p>
     <w:p>
       <w:pPr>
         <w:pStyle w:val="ReportHeading1"/>
+        <w:keepNext/>
+        <w:pageBreakBefore w:val="0"/>
         <w:rPr/>
       </w:pPr>
       <w:r>
@@ -1316,6 +1318,8 @@
     <w:p>
       <w:pPr>
         <w:pStyle w:val="ReportHeading1"/>
+        <w:keepNext/>
+        <w:pageBreakBefore w:val="0"/>
         <w:rPr/>
       </w:pPr>
       <w:r>
@@ -2783,6 +2787,8 @@
     <w:p>
       <w:pPr>
         <w:pStyle w:val="ReportHeading1"/>
+        <w:keepNext/>
+        <w:pageBreakBefore w:val="0"/>
         <w:rPr/>
       </w:pPr>
       <w:r>
@@ -3301,6 +3307,8 @@
     <w:p>
       <w:pPr>
         <w:pStyle w:val="ReportHeading1"/>
+        <w:keepNext/>
+        <w:pageBreakBefore w:val="0"/>
         <w:rPr/>
       </w:pPr>
       <w:r>
@@ -3325,7 +3333,7 @@
       </w:pPr>
       <w:r>
         <w:rPr/>
-        <w:t>Прямое распространение сигнала через sign() не дифференцируемо, поэтому обучение выполнено методом BinaryConnect / Straight-Through Estimator (Courbariaux et al., 2016) — реализовано вручную на NumPy без сторонних ML-библиотек (PyTorch недоступен в окружении). Хранятся вещественные «теневые» веса W_A, W_B; на прямом проходе W_B и активации после слоя A бинаризуются знаком; на обратном проходе производная sign(t) заменяется производной hard tanh:</w:t>
+        <w:t>Прямое распространение сигнала через sign() не дифференцируемо, поэтому обучение выполнено методом BinaryConnect / Straight-Through Estimator (Courbariaux et al., 2016) — реализовано вручную на NumPy без сторонних ML-библиотек. Хранятся вещественные «теневые» веса W_A, W_B; на прямом проходе W_B и активации после слоя A бинаризуются знаком; на обратном проходе производная sign(t) заменяется производной hard tanh:</w:t>
       </w:r>
     </w:p>
     <w:tbl>
@@ -3696,6 +3704,8 @@
     <w:p>
       <w:pPr>
         <w:pStyle w:val="ReportHeading1"/>
+        <w:keepNext/>
+        <w:pageBreakBefore w:val="0"/>
         <w:rPr/>
       </w:pPr>
       <w:r>
@@ -4387,6 +4397,8 @@
     <w:p>
       <w:pPr>
         <w:pStyle w:val="ReportHeading1"/>
+        <w:keepNext/>
+        <w:pageBreakBefore w:val="0"/>
       </w:pPr>
       <w:r>
         <w:t>6 ПОСТАНОВКА ЗАДАЧИ ПРАКТИЧЕСКОЙ РАБОТЫ № 2</w:t>
@@ -4757,168 +4769,72 @@
         <w:spacing w:before="120"/>
       </w:pPr>
       <w:r>
-        <w:t>Проект bnn_pr2 создан в Vivado 2022.2 для кристалла Xilinx Artix-7 xc7a100tcsg324-1. В его состав входят RTL-модуль, тестбенч и файлы памяти с параметрами и тестовыми данными (рисунки 6.1 и 6.2).</w:t>
-      </w:r>
-    </w:p>
-    <w:p>
-      <w:pPr>
+        <w:t>Единый проект ПР2–ПР3 создан в Vivado 2022.2 для кристалла Xilinx Artix-7 xc7a100tcsg324-1. В него включены RTL-модули, тестбенчи и файлы памяти с параметрами и контрольными данными.</w:t>
+      </w:r>
+    </w:p>
+    <w:p>
+      <w:pPr>
+        <w:pStyle w:val="ReportHeading1"/>
         <w:keepNext/>
-        <w:jc w:val="center"/>
-      </w:pPr>
-      <w:r>
-        <w:drawing>
-          <wp:inline xmlns:a="http://schemas.openxmlformats.org/drawingml/2006/main">
-            <wp:extent cx="5580000" cy="3487500"/>
-            <wp:docPr id="5" name="Picture 5"/>
-            <wp:cNvGraphicFramePr>
-              <a:graphicFrameLocks noChangeAspect="1"/>
-            </wp:cNvGraphicFramePr>
-            <a:graphic>
-              <a:graphicData uri="http://schemas.openxmlformats.org/drawingml/2006/picture">
-                <pic:pic>
-                  <pic:nvPicPr>
-                    <pic:cNvPr id="0" name="vivado_project.jpg"/>
-                    <pic:cNvPicPr/>
-                  </pic:nvPicPr>
-                  <pic:blipFill>
-                    <a:blip r:embed="rId12"/>
-                    <a:stretch>
-                      <a:fillRect/>
-                    </a:stretch>
-                  </pic:blipFill>
-                  <pic:spPr>
-                    <a:xfrm>
-                      <a:off x="0" y="0"/>
-                      <a:ext cx="5580000" cy="3487500"/>
-                    </a:xfrm>
-                    <a:prstGeom prst="rect"/>
-                  </pic:spPr>
-                </pic:pic>
-              </a:graphicData>
-            </a:graphic>
-          </wp:inline>
-        </w:drawing>
+        <w:pageBreakBefore w:val="0"/>
+      </w:pPr>
+      <w:r>
+        <w:t>7 РЕАЛИЗАЦИЯ RTL-МОДЕЛИ</w:t>
+      </w:r>
+    </w:p>
+    <w:p>
+      <w:pPr>
+        <w:pStyle w:val="ReportHeading2"/>
+      </w:pPr>
+      <w:r>
+        <w:t>7.1 Слой A: знаковое умножение и накопление</w:t>
       </w:r>
     </w:p>
     <w:p>
       <w:pPr>
         <w:pStyle w:val="ReportBody"/>
-        <w:spacing w:after="240"/>
-        <w:jc w:val="center"/>
-      </w:pPr>
-      <w:r>
-        <w:t>Рисунок 6.1 — Проект RTL-модели в Vivado 2022.2</w:t>
-      </w:r>
-    </w:p>
-    <w:p>
-      <w:pPr>
+      </w:pPr>
+      <w:r>
+        <w:t>Восемь нейронов слоя A вычисляют z_h = b_A[h] + Σ_j x_j·W_A[j,h] для j=0…4. Веса W_A загружаются в порядке j·8+h. Операнды int8 явно трактуются как знаковые; произведение хранится в 16 битах и расширяется до 32 бит перед сложением со смещением int32. Промежуточный бит a_h равен 1 тогда и только тогда, когда z_h≥0. При нулевой сумме бит также равен 1, как и в программном эталоне.</w:t>
+      </w:r>
+    </w:p>
+    <w:p>
+      <w:pPr>
+        <w:pStyle w:val="ReportHeading2"/>
+      </w:pPr>
+      <w:r>
+        <w:t>7.2 Слой B: XNOR и popcount</w:t>
+      </w:r>
+    </w:p>
+    <w:p>
+      <w:pPr>
+        <w:pStyle w:val="ReportBody"/>
+      </w:pPr>
+      <w:r>
+        <w:t>Восемь бинарных весов W_B сравниваются с битами a_h операцией XNOR. Четырёхбитный счётчик определяет число совпадений от 0 до 8. Итоговая сумма вычисляется как y = 2·popcount(XNOR(a,W_B)) − 8 + b_B; выход fall_detected равен 1 при y≥0. Эта формула бит в бит соответствует программной модели и не требует вещественной арифметики во время вывода.</w:t>
+      </w:r>
+    </w:p>
+    <w:p>
+      <w:pPr>
+        <w:pStyle w:val="ReportHeading2"/>
+      </w:pPr>
+      <w:r>
+        <w:t>7.3 Регистры, сброс и загрузка параметров</w:t>
+      </w:r>
+    </w:p>
+    <w:p>
+      <w:pPr>
+        <w:pStyle w:val="ReportBody"/>
+      </w:pPr>
+      <w:r>
+        <w:t>Комбинационная часть рассчитывает оба слоя для текущего входа. На ближайшем фронте clk при valid_in=1 сохраняются выходной бит и valid_out=1; при отсутствии входа valid_out=0, а последний бит остаётся неизменным. Синхронный сброс обнуляет оба регистра. Веса и смещения загружаются из четырёх .mem-файлов через $readmemh: 40 весов W_A идут в порядке j·8+h, за ними отдельно хранятся 8 смещений b_A, 8 бинарных весов W_B и смещение b_B. Каждая строка файла памяти задаёт одно значение в hex-формате.</w:t>
+      </w:r>
+    </w:p>
+    <w:p>
+      <w:pPr>
+        <w:pStyle w:val="ReportHeading1"/>
         <w:keepNext/>
-        <w:jc w:val="center"/>
-      </w:pPr>
-      <w:r>
-        <w:drawing>
-          <wp:inline xmlns:a="http://schemas.openxmlformats.org/drawingml/2006/main">
-            <wp:extent cx="5580000" cy="3487500"/>
-            <wp:docPr id="6" name="Picture 6"/>
-            <wp:cNvGraphicFramePr>
-              <a:graphicFrameLocks noChangeAspect="1"/>
-            </wp:cNvGraphicFramePr>
-            <a:graphic>
-              <a:graphicData uri="http://schemas.openxmlformats.org/drawingml/2006/picture">
-                <pic:pic>
-                  <pic:nvPicPr>
-                    <pic:cNvPr id="0" name="vivado_rtl_code_interface.jpg"/>
-                    <pic:cNvPicPr/>
-                  </pic:nvPicPr>
-                  <pic:blipFill>
-                    <a:blip r:embed="rId13"/>
-                    <a:stretch>
-                      <a:fillRect/>
-                    </a:stretch>
-                  </pic:blipFill>
-                  <pic:spPr>
-                    <a:xfrm>
-                      <a:off x="0" y="0"/>
-                      <a:ext cx="5580000" cy="3487500"/>
-                    </a:xfrm>
-                    <a:prstGeom prst="rect"/>
-                  </pic:spPr>
-                </pic:pic>
-              </a:graphicData>
-            </a:graphic>
-          </wp:inline>
-        </w:drawing>
-      </w:r>
-    </w:p>
-    <w:p>
-      <w:pPr>
-        <w:pStyle w:val="ReportBody"/>
-        <w:spacing w:after="240"/>
-        <w:jc w:val="center"/>
-      </w:pPr>
-      <w:r>
-        <w:t>Рисунок 6.2 — Интерфейс и загрузка параметров в коде Verilog</w:t>
-      </w:r>
-    </w:p>
-    <w:p>
-      <w:pPr>
-        <w:pStyle w:val="ReportHeading1"/>
-      </w:pPr>
-      <w:r>
-        <w:t>7 РЕАЛИЗАЦИЯ RTL-МОДЕЛИ</w:t>
-      </w:r>
-    </w:p>
-    <w:p>
-      <w:pPr>
-        <w:pStyle w:val="ReportHeading2"/>
-      </w:pPr>
-      <w:r>
-        <w:t>7.1 Слой A: знаковое умножение и накопление</w:t>
-      </w:r>
-    </w:p>
-    <w:p>
-      <w:pPr>
-        <w:pStyle w:val="ReportBody"/>
-      </w:pPr>
-      <w:r>
-        <w:t>Восемь нейронов слоя A вычисляют z_h = b_A[h] + Σ_j x_j·W_A[j,h] для j=0…4. Веса W_A загружаются в порядке j·8+h. Операнды int8 явно трактуются как знаковые; произведение хранится в 16 битах и расширяется до 32 бит перед сложением со смещением int32. Промежуточный бит a_h равен 1 тогда и только тогда, когда z_h≥0. При нулевой сумме бит также равен 1, как и в программном эталоне.</w:t>
-      </w:r>
-    </w:p>
-    <w:p>
-      <w:pPr>
-        <w:pStyle w:val="ReportHeading2"/>
-      </w:pPr>
-      <w:r>
-        <w:t>7.2 Слой B: XNOR и popcount</w:t>
-      </w:r>
-    </w:p>
-    <w:p>
-      <w:pPr>
-        <w:pStyle w:val="ReportBody"/>
-      </w:pPr>
-      <w:r>
-        <w:t>Восемь бинарных весов W_B сравниваются с битами a_h операцией XNOR. Четырёхбитный счётчик определяет число совпадений от 0 до 8. Итоговая сумма вычисляется как y = 2·popcount(XNOR(a,W_B)) − 8 + b_B; выход fall_detected равен 1 при y≥0. Эта формула бит в бит соответствует программной модели и не требует вещественной арифметики во время вывода.</w:t>
-      </w:r>
-    </w:p>
-    <w:p>
-      <w:pPr>
-        <w:pStyle w:val="ReportHeading2"/>
-      </w:pPr>
-      <w:r>
-        <w:t>7.3 Регистры, сброс и загрузка параметров</w:t>
-      </w:r>
-    </w:p>
-    <w:p>
-      <w:pPr>
-        <w:pStyle w:val="ReportBody"/>
-      </w:pPr>
-      <w:r>
-        <w:t>Комбинационная часть рассчитывает оба слоя для текущего входа. На ближайшем фронте clk при valid_in=1 сохраняются выходной бит и valid_out=1; при отсутствии входа valid_out=0, а последний бит остаётся неизменным. Синхронный сброс обнуляет оба регистра. Веса и смещения загружаются из четырёх .mem-файлов через $readmemh: 40 весов W_A идут в порядке j·8+h, за ними отдельно хранятся 8 смещений b_A, 8 бинарных весов W_B и смещение b_B. Каждая строка файла памяти задаёт одно значение в hex-формате.</w:t>
-      </w:r>
-    </w:p>
-    <w:p>
-      <w:pPr>
-        <w:pStyle w:val="ReportHeading1"/>
+        <w:pageBreakBefore w:val="0"/>
       </w:pPr>
       <w:r>
         <w:t>8 СИМУЛЯЦИЯ И СВЕРКА С ЭТАЛОНОМ</w:t>
@@ -5123,7 +5039,766 @@
         <w:pStyle w:val="ReportBody"/>
       </w:pPr>
       <w:r>
-        <w:t>В Vivado 2022.2 создан проект bnn_pr2 для xc7a100tcsg324-1. Поведенческая симуляция XSim завершилась сообщением PASS: 2331 vectors (рисунок 8.1). Временные диаграммы показаны на рисунке 8.2. Синтез успешно завершился; получена логическая схема из 960 ячеек (рисунок 8.3). Согласно отчёту ресурсов (рисунок 8.4), использовано 629 Slice LUT, 2 Slice Register, 45 Bonded IOB и 1 BUFGCTRL. Оценка ресурсов относится только к синтезу; размещение, трассировка и анализ таймингов не выполнялись.</w:t>
+        <w:t>В Vivado 2022.2 создан проект для xc7a100tcsg324-1. Поведенческая симуляция XSim завершилась сообщением PASS: 2331 vectors. Синтез успешно завершился; получена логическая схема классификатора (рисунок 8.1). Согласно отчёту ресурсов, использовано 595 Slice LUT, 2 Slice Register, 45 Bonded IOB и 1 BUFGCTRL. Эти показатели относятся к отдельному ядру после синтеза. Размещение и сравнение вариантов выполнены в ПР3.</w:t>
+      </w:r>
+    </w:p>
+    <w:p>
+      <w:pPr>
+        <w:pStyle w:val="ReportTableCaption"/>
+      </w:pPr>
+      <w:r>
+        <w:t>Таблица 8.2 — Ресурсы отдельного классификатора после синтеза</w:t>
+      </w:r>
+    </w:p>
+    <w:tbl>
+      <w:tblPr>
+        <w:tblW w:type="auto" w:w="0"/>
+        <w:tblLayout w:type="fixed"/>
+        <w:tblLook w:firstColumn="1" w:firstRow="1" w:lastColumn="0" w:lastRow="0" w:noHBand="0" w:noVBand="1" w:val="04A0"/>
+        <w:tblBorders>
+          <w:top w:val="single" w:sz="4" w:color="000000"/>
+          <w:left w:val="single" w:sz="4" w:color="000000"/>
+          <w:bottom w:val="single" w:sz="4" w:color="000000"/>
+          <w:right w:val="single" w:sz="4" w:color="000000"/>
+          <w:insideH w:val="single" w:sz="4" w:color="000000"/>
+          <w:insideV w:val="single" w:sz="4" w:color="000000"/>
+        </w:tblBorders>
+      </w:tblPr>
+      <w:tblGrid>
+        <w:gridCol w:w="4535"/>
+        <w:gridCol w:w="4252"/>
+      </w:tblGrid>
+      <w:tr>
+        <w:tc>
+          <w:tcPr>
+            <w:tcW w:type="dxa" w:w="4535"/>
+          </w:tcPr>
+          <w:p>
+            <w:pPr>
+              <w:pStyle w:val="ReportTableText"/>
+              <w:jc w:val="center"/>
+            </w:pPr>
+            <w:r>
+              <w:rPr>
+                <w:b/>
+              </w:rPr>
+              <w:t>Ресурс</w:t>
+            </w:r>
+          </w:p>
+        </w:tc>
+        <w:tc>
+          <w:tcPr>
+            <w:tcW w:type="dxa" w:w="4252"/>
+          </w:tcPr>
+          <w:p>
+            <w:pPr>
+              <w:pStyle w:val="ReportTableText"/>
+              <w:jc w:val="center"/>
+            </w:pPr>
+            <w:r>
+              <w:rPr>
+                <w:b/>
+              </w:rPr>
+              <w:t>Количество</w:t>
+            </w:r>
+          </w:p>
+        </w:tc>
+      </w:tr>
+      <w:tr>
+        <w:tc>
+          <w:tcPr>
+            <w:tcW w:type="dxa" w:w="4535"/>
+          </w:tcPr>
+          <w:p>
+            <w:pPr>
+              <w:pStyle w:val="ReportTableText"/>
+            </w:pPr>
+            <w:r>
+              <w:t>Slice LUT</w:t>
+            </w:r>
+          </w:p>
+        </w:tc>
+        <w:tc>
+          <w:tcPr>
+            <w:tcW w:type="dxa" w:w="4252"/>
+          </w:tcPr>
+          <w:p>
+            <w:pPr>
+              <w:pStyle w:val="ReportTableText"/>
+            </w:pPr>
+            <w:r>
+              <w:t>595</w:t>
+            </w:r>
+          </w:p>
+        </w:tc>
+      </w:tr>
+      <w:tr>
+        <w:tc>
+          <w:tcPr>
+            <w:tcW w:type="dxa" w:w="4535"/>
+          </w:tcPr>
+          <w:p>
+            <w:pPr>
+              <w:pStyle w:val="ReportTableText"/>
+            </w:pPr>
+            <w:r>
+              <w:t>Slice Register</w:t>
+            </w:r>
+          </w:p>
+        </w:tc>
+        <w:tc>
+          <w:tcPr>
+            <w:tcW w:type="dxa" w:w="4252"/>
+          </w:tcPr>
+          <w:p>
+            <w:pPr>
+              <w:pStyle w:val="ReportTableText"/>
+            </w:pPr>
+            <w:r>
+              <w:t>2</w:t>
+            </w:r>
+          </w:p>
+        </w:tc>
+      </w:tr>
+      <w:tr>
+        <w:tc>
+          <w:tcPr>
+            <w:tcW w:type="dxa" w:w="4535"/>
+          </w:tcPr>
+          <w:p>
+            <w:pPr>
+              <w:pStyle w:val="ReportTableText"/>
+            </w:pPr>
+            <w:r>
+              <w:t>Bonded IOB</w:t>
+            </w:r>
+          </w:p>
+        </w:tc>
+        <w:tc>
+          <w:tcPr>
+            <w:tcW w:type="dxa" w:w="4252"/>
+          </w:tcPr>
+          <w:p>
+            <w:pPr>
+              <w:pStyle w:val="ReportTableText"/>
+            </w:pPr>
+            <w:r>
+              <w:t>45</w:t>
+            </w:r>
+          </w:p>
+        </w:tc>
+      </w:tr>
+      <w:tr>
+        <w:tc>
+          <w:tcPr>
+            <w:tcW w:type="dxa" w:w="4535"/>
+          </w:tcPr>
+          <w:p>
+            <w:pPr>
+              <w:pStyle w:val="ReportTableText"/>
+            </w:pPr>
+            <w:r>
+              <w:t>BUFGCTRL</w:t>
+            </w:r>
+          </w:p>
+        </w:tc>
+        <w:tc>
+          <w:tcPr>
+            <w:tcW w:type="dxa" w:w="4252"/>
+          </w:tcPr>
+          <w:p>
+            <w:pPr>
+              <w:pStyle w:val="ReportTableText"/>
+            </w:pPr>
+            <w:r>
+              <w:t>1</w:t>
+            </w:r>
+          </w:p>
+        </w:tc>
+      </w:tr>
+    </w:tbl>
+    <w:p>
+      <w:pPr>
+        <w:keepNext/>
+        <w:jc w:val="center"/>
+      </w:pPr>
+      <w:r>
+        <w:drawing>
+          <wp:inline xmlns:a="http://schemas.openxmlformats.org/drawingml/2006/main">
+            <wp:extent cx="5580000" cy="3487500"/>
+            <wp:docPr id="5" name="Picture 5"/>
+            <wp:cNvGraphicFramePr>
+              <a:graphicFrameLocks noChangeAspect="1"/>
+            </wp:cNvGraphicFramePr>
+            <a:graphic>
+              <a:graphicData uri="http://schemas.openxmlformats.org/drawingml/2006/picture">
+                <pic:pic>
+                  <pic:nvPicPr>
+                    <pic:cNvPr id="0" name="vivado_pr23_pr2_schematic.jpg"/>
+                    <pic:cNvPicPr/>
+                  </pic:nvPicPr>
+                  <pic:blipFill>
+                    <a:blip r:embed="rId12"/>
+                    <a:stretch>
+                      <a:fillRect/>
+                    </a:stretch>
+                  </pic:blipFill>
+                  <pic:spPr>
+                    <a:xfrm>
+                      <a:off x="0" y="0"/>
+                      <a:ext cx="5580000" cy="3487500"/>
+                    </a:xfrm>
+                    <a:prstGeom prst="rect"/>
+                  </pic:spPr>
+                </pic:pic>
+              </a:graphicData>
+            </a:graphic>
+          </wp:inline>
+        </w:drawing>
+      </w:r>
+    </w:p>
+    <w:p>
+      <w:pPr>
+        <w:pStyle w:val="ReportBody"/>
+        <w:spacing w:after="240"/>
+        <w:jc w:val="center"/>
+      </w:pPr>
+      <w:r>
+        <w:t>Рисунок 8.1 — Синтезированная схема классификатора</w:t>
+      </w:r>
+    </w:p>
+    <w:p>
+      <w:pPr>
+        <w:pStyle w:val="ReportHeading1"/>
+        <w:keepNext/>
+        <w:pageBreakBefore w:val="0"/>
+      </w:pPr>
+      <w:r>
+        <w:t>9 ПРОТОТИП И КОНВЕЙЕРНАЯ АРХИТЕКТУРА</w:t>
+      </w:r>
+    </w:p>
+    <w:p>
+      <w:pPr>
+        <w:pStyle w:val="ReportHeading2"/>
+      </w:pPr>
+      <w:r>
+        <w:t>9.1 Верхний модуль и контрольные данные</w:t>
+      </w:r>
+    </w:p>
+    <w:p>
+      <w:pPr>
+        <w:pStyle w:val="ReportBody"/>
+      </w:pPr>
+      <w:r>
+        <w:t>Верхний модуль fpga_top хранит 64 входных слова и 64 ожидаемых бита, подготовленных программной моделью. Автомат IDLE–DRIVE–CHECK подаёт по одному вектору, сверяет ответ классификатора и ведёт счётчики проверок и расхождений. После последней проверки устанавливаются done и pass. Повторный импульс start запускает проверку заново. Для конвейерного классификатора реализован fpga_top_pipelined: он подаёт новый вектор каждый такт и задерживает индекс эталона вместе с ответом.</w:t>
+      </w:r>
+    </w:p>
+    <w:p>
+      <w:pPr>
+        <w:pStyle w:val="ReportTableCaption"/>
+      </w:pPr>
+      <w:r>
+        <w:t>Таблица 9.1 — Сигналы верхнего модуля</w:t>
+      </w:r>
+    </w:p>
+    <w:tbl>
+      <w:tblPr>
+        <w:tblW w:type="auto" w:w="0"/>
+        <w:tblLayout w:type="fixed"/>
+        <w:tblLook w:firstColumn="1" w:firstRow="1" w:lastColumn="0" w:lastRow="0" w:noHBand="0" w:noVBand="1" w:val="04A0"/>
+        <w:tblBorders>
+          <w:top w:val="single" w:sz="4" w:color="000000"/>
+          <w:left w:val="single" w:sz="4" w:color="000000"/>
+          <w:bottom w:val="single" w:sz="4" w:color="000000"/>
+          <w:right w:val="single" w:sz="4" w:color="000000"/>
+          <w:insideH w:val="single" w:sz="4" w:color="000000"/>
+          <w:insideV w:val="single" w:sz="4" w:color="000000"/>
+        </w:tblBorders>
+      </w:tblPr>
+      <w:tblGrid>
+        <w:gridCol w:w="2835"/>
+        <w:gridCol w:w="1587"/>
+        <w:gridCol w:w="4365"/>
+      </w:tblGrid>
+      <w:tr>
+        <w:tc>
+          <w:tcPr>
+            <w:tcW w:type="dxa" w:w="2835"/>
+          </w:tcPr>
+          <w:p>
+            <w:pPr>
+              <w:pStyle w:val="ReportTableText"/>
+              <w:jc w:val="center"/>
+            </w:pPr>
+            <w:r>
+              <w:rPr>
+                <w:b/>
+              </w:rPr>
+              <w:t>Сигнал</w:t>
+            </w:r>
+          </w:p>
+        </w:tc>
+        <w:tc>
+          <w:tcPr>
+            <w:tcW w:type="dxa" w:w="1587"/>
+          </w:tcPr>
+          <w:p>
+            <w:pPr>
+              <w:pStyle w:val="ReportTableText"/>
+              <w:jc w:val="center"/>
+            </w:pPr>
+            <w:r>
+              <w:rPr>
+                <w:b/>
+              </w:rPr>
+              <w:t>Разрядность</w:t>
+            </w:r>
+          </w:p>
+        </w:tc>
+        <w:tc>
+          <w:tcPr>
+            <w:tcW w:type="dxa" w:w="4365"/>
+          </w:tcPr>
+          <w:p>
+            <w:pPr>
+              <w:pStyle w:val="ReportTableText"/>
+              <w:jc w:val="center"/>
+            </w:pPr>
+            <w:r>
+              <w:rPr>
+                <w:b/>
+              </w:rPr>
+              <w:t>Назначение</w:t>
+            </w:r>
+          </w:p>
+        </w:tc>
+      </w:tr>
+      <w:tr>
+        <w:tc>
+          <w:tcPr>
+            <w:tcW w:type="dxa" w:w="2835"/>
+          </w:tcPr>
+          <w:p>
+            <w:pPr>
+              <w:pStyle w:val="ReportTableText"/>
+            </w:pPr>
+            <w:r>
+              <w:t>clk, rst_n</w:t>
+            </w:r>
+          </w:p>
+        </w:tc>
+        <w:tc>
+          <w:tcPr>
+            <w:tcW w:type="dxa" w:w="1587"/>
+          </w:tcPr>
+          <w:p>
+            <w:pPr>
+              <w:pStyle w:val="ReportTableText"/>
+            </w:pPr>
+            <w:r>
+              <w:t>1 + 1</w:t>
+            </w:r>
+          </w:p>
+        </w:tc>
+        <w:tc>
+          <w:tcPr>
+            <w:tcW w:type="dxa" w:w="4365"/>
+          </w:tcPr>
+          <w:p>
+            <w:pPr>
+              <w:pStyle w:val="ReportTableText"/>
+            </w:pPr>
+            <w:r>
+              <w:t>Тактирование и синхронный сброс</w:t>
+            </w:r>
+          </w:p>
+        </w:tc>
+      </w:tr>
+      <w:tr>
+        <w:tc>
+          <w:tcPr>
+            <w:tcW w:type="dxa" w:w="2835"/>
+          </w:tcPr>
+          <w:p>
+            <w:pPr>
+              <w:pStyle w:val="ReportTableText"/>
+            </w:pPr>
+            <w:r>
+              <w:t>start</w:t>
+            </w:r>
+          </w:p>
+        </w:tc>
+        <w:tc>
+          <w:tcPr>
+            <w:tcW w:type="dxa" w:w="1587"/>
+          </w:tcPr>
+          <w:p>
+            <w:pPr>
+              <w:pStyle w:val="ReportTableText"/>
+            </w:pPr>
+            <w:r>
+              <w:t>1</w:t>
+            </w:r>
+          </w:p>
+        </w:tc>
+        <w:tc>
+          <w:tcPr>
+            <w:tcW w:type="dxa" w:w="4365"/>
+          </w:tcPr>
+          <w:p>
+            <w:pPr>
+              <w:pStyle w:val="ReportTableText"/>
+            </w:pPr>
+            <w:r>
+              <w:t>Начало контрольного прогона</w:t>
+            </w:r>
+          </w:p>
+        </w:tc>
+      </w:tr>
+      <w:tr>
+        <w:tc>
+          <w:tcPr>
+            <w:tcW w:type="dxa" w:w="2835"/>
+          </w:tcPr>
+          <w:p>
+            <w:pPr>
+              <w:pStyle w:val="ReportTableText"/>
+            </w:pPr>
+            <w:r>
+              <w:t>busy, done, pass</w:t>
+            </w:r>
+          </w:p>
+        </w:tc>
+        <w:tc>
+          <w:tcPr>
+            <w:tcW w:type="dxa" w:w="1587"/>
+          </w:tcPr>
+          <w:p>
+            <w:pPr>
+              <w:pStyle w:val="ReportTableText"/>
+            </w:pPr>
+            <w:r>
+              <w:t>1 + 1 + 1</w:t>
+            </w:r>
+          </w:p>
+        </w:tc>
+        <w:tc>
+          <w:tcPr>
+            <w:tcW w:type="dxa" w:w="4365"/>
+          </w:tcPr>
+          <w:p>
+            <w:pPr>
+              <w:pStyle w:val="ReportTableText"/>
+            </w:pPr>
+            <w:r>
+              <w:t>Ход, завершение и результат</w:t>
+            </w:r>
+          </w:p>
+        </w:tc>
+      </w:tr>
+      <w:tr>
+        <w:tc>
+          <w:tcPr>
+            <w:tcW w:type="dxa" w:w="2835"/>
+          </w:tcPr>
+          <w:p>
+            <w:pPr>
+              <w:pStyle w:val="ReportTableText"/>
+            </w:pPr>
+            <w:r>
+              <w:t>checked_count, error_count</w:t>
+            </w:r>
+          </w:p>
+        </w:tc>
+        <w:tc>
+          <w:tcPr>
+            <w:tcW w:type="dxa" w:w="1587"/>
+          </w:tcPr>
+          <w:p>
+            <w:pPr>
+              <w:pStyle w:val="ReportTableText"/>
+            </w:pPr>
+            <w:r>
+              <w:t>7 + 7</w:t>
+            </w:r>
+          </w:p>
+        </w:tc>
+        <w:tc>
+          <w:tcPr>
+            <w:tcW w:type="dxa" w:w="4365"/>
+          </w:tcPr>
+          <w:p>
+            <w:pPr>
+              <w:pStyle w:val="ReportTableText"/>
+            </w:pPr>
+            <w:r>
+              <w:t>Проверенные векторы и расхождения</w:t>
+            </w:r>
+          </w:p>
+        </w:tc>
+      </w:tr>
+      <w:tr>
+        <w:tc>
+          <w:tcPr>
+            <w:tcW w:type="dxa" w:w="2835"/>
+          </w:tcPr>
+          <w:p>
+            <w:pPr>
+              <w:pStyle w:val="ReportTableText"/>
+            </w:pPr>
+            <w:r>
+              <w:t>last_prediction</w:t>
+            </w:r>
+          </w:p>
+        </w:tc>
+        <w:tc>
+          <w:tcPr>
+            <w:tcW w:type="dxa" w:w="1587"/>
+          </w:tcPr>
+          <w:p>
+            <w:pPr>
+              <w:pStyle w:val="ReportTableText"/>
+            </w:pPr>
+            <w:r>
+              <w:t>1</w:t>
+            </w:r>
+          </w:p>
+        </w:tc>
+        <w:tc>
+          <w:tcPr>
+            <w:tcW w:type="dxa" w:w="4365"/>
+          </w:tcPr>
+          <w:p>
+            <w:pPr>
+              <w:pStyle w:val="ReportTableText"/>
+            </w:pPr>
+            <w:r>
+              <w:t>Последний ответ сети</w:t>
+            </w:r>
+          </w:p>
+        </w:tc>
+      </w:tr>
+    </w:tbl>
+    <w:p>
+      <w:pPr>
+        <w:pStyle w:val="ReportBody"/>
+      </w:pPr>
+      <w:r>
+        <w:t>Контрольный набор подтверждает работу автомата, но он постоянен для синтезатора. Поэтому его схема не используется для оценки выигрыша в частоте: Vivado вправе упростить вычисления под 64 известных слова. Размещение верхнего модуля показано на рисунке 9.1.</w:t>
+      </w:r>
+    </w:p>
+    <w:p>
+      <w:pPr>
+        <w:keepNext/>
+        <w:jc w:val="center"/>
+      </w:pPr>
+      <w:r>
+        <w:drawing>
+          <wp:inline xmlns:a="http://schemas.openxmlformats.org/drawingml/2006/main">
+            <wp:extent cx="5580000" cy="3487500"/>
+            <wp:docPr id="6" name="Picture 6"/>
+            <wp:cNvGraphicFramePr>
+              <a:graphicFrameLocks noChangeAspect="1"/>
+            </wp:cNvGraphicFramePr>
+            <a:graphic>
+              <a:graphicData uri="http://schemas.openxmlformats.org/drawingml/2006/picture">
+                <pic:pic>
+                  <pic:nvPicPr>
+                    <pic:cNvPr id="0" name="vivado_pr23_prototype_device.jpg"/>
+                    <pic:cNvPicPr/>
+                  </pic:nvPicPr>
+                  <pic:blipFill>
+                    <a:blip r:embed="rId13"/>
+                    <a:stretch>
+                      <a:fillRect/>
+                    </a:stretch>
+                  </pic:blipFill>
+                  <pic:spPr>
+                    <a:xfrm>
+                      <a:off x="0" y="0"/>
+                      <a:ext cx="5580000" cy="3487500"/>
+                    </a:xfrm>
+                    <a:prstGeom prst="rect"/>
+                  </pic:spPr>
+                </pic:pic>
+              </a:graphicData>
+            </a:graphic>
+          </wp:inline>
+        </w:drawing>
+      </w:r>
+    </w:p>
+    <w:p>
+      <w:pPr>
+        <w:pStyle w:val="ReportBody"/>
+        <w:spacing w:after="240"/>
+        <w:jc w:val="center"/>
+      </w:pPr>
+      <w:r>
+        <w:t>Рисунок 9.1 — Размещение прототипа на кристалле</w:t>
+      </w:r>
+    </w:p>
+    <w:p>
+      <w:pPr>
+        <w:pStyle w:val="ReportHeading2"/>
+      </w:pPr>
+      <w:r>
+        <w:t>9.2 Регистры между вычислительными слоями</w:t>
+      </w:r>
+    </w:p>
+    <w:p>
+      <w:pPr>
+        <w:pStyle w:val="ReportBody"/>
+      </w:pPr>
+      <w:r>
+        <w:t>В исходном классификаторе оба слоя образуют одну комбинационную цепь до регистра ответа. Для измерения этот тракт собран из тех же модулей bnn_layer_a и bnn_layer_b, что и конвейерный вариант. Восемь бит после слоя A и сигнал valid записываются в регистры; слой B формирует результат для следующего фронта. Регистр поставлен на границе слоёв, а не после каждого арифметического действия. Оба ядра принимают один вектор каждый такт, но конвейерный ответ появляется на один такт позже. Объявление reg в комбинационном always само по себе не означает физический регистр; его создаёт запись на posedge clk.</w:t>
+      </w:r>
+    </w:p>
+    <w:tbl>
+      <w:tblPr>
+        <w:tblW w:type="auto" w:w="0"/>
+        <w:tblLayout w:type="fixed"/>
+        <w:tblLook w:firstColumn="1" w:firstRow="1" w:lastColumn="0" w:lastRow="0" w:noHBand="0" w:noVBand="1" w:val="04A0"/>
+      </w:tblPr>
+      <w:tblGrid>
+        <w:gridCol w:w="1928"/>
+        <w:gridCol w:w="1928"/>
+        <w:gridCol w:w="1928"/>
+        <w:gridCol w:w="1928"/>
+        <w:gridCol w:w="1928"/>
+      </w:tblGrid>
+      <w:tr>
+        <w:tc>
+          <w:tcPr>
+            <w:tcW w:type="dxa" w:w="1757"/>
+          </w:tcPr>
+          <w:p>
+            <w:pPr>
+              <w:pStyle w:val="ReportTableText"/>
+              <w:jc w:val="center"/>
+            </w:pPr>
+            <w:r>
+              <w:t>Входной регистр</w:t>
+              <w:br/>
+              <w:t>5 признаков</w:t>
+            </w:r>
+          </w:p>
+        </w:tc>
+        <w:tc>
+          <w:tcPr>
+            <w:tcW w:type="dxa" w:w="1757"/>
+          </w:tcPr>
+          <w:p>
+            <w:pPr>
+              <w:pStyle w:val="ReportTableText"/>
+              <w:jc w:val="center"/>
+            </w:pPr>
+            <w:r>
+              <w:t>Слой A</w:t>
+              <w:br/>
+              <w:t>5 × 8 MAC</w:t>
+            </w:r>
+          </w:p>
+        </w:tc>
+        <w:tc>
+          <w:tcPr>
+            <w:tcW w:type="dxa" w:w="1757"/>
+          </w:tcPr>
+          <w:p>
+            <w:pPr>
+              <w:pStyle w:val="ReportTableText"/>
+              <w:jc w:val="center"/>
+            </w:pPr>
+            <w:r>
+              <w:t>Регистр</w:t>
+              <w:br/>
+              <w:t>8 бит + valid</w:t>
+            </w:r>
+          </w:p>
+        </w:tc>
+        <w:tc>
+          <w:tcPr>
+            <w:tcW w:type="dxa" w:w="1757"/>
+          </w:tcPr>
+          <w:p>
+            <w:pPr>
+              <w:pStyle w:val="ReportTableText"/>
+              <w:jc w:val="center"/>
+            </w:pPr>
+            <w:r>
+              <w:t>Слой B</w:t>
+              <w:br/>
+              <w:t>XNOR + popcount</w:t>
+            </w:r>
+          </w:p>
+        </w:tc>
+        <w:tc>
+          <w:tcPr>
+            <w:tcW w:type="dxa" w:w="1757"/>
+          </w:tcPr>
+          <w:p>
+            <w:pPr>
+              <w:pStyle w:val="ReportTableText"/>
+              <w:jc w:val="center"/>
+            </w:pPr>
+            <w:r>
+              <w:t>Регистр</w:t>
+              <w:br/>
+              <w:t>ответ + valid</w:t>
+            </w:r>
+          </w:p>
+        </w:tc>
+      </w:tr>
+    </w:tbl>
+    <w:p>
+      <w:pPr>
+        <w:pStyle w:val="ReportBody"/>
+        <w:spacing w:before="120" w:after="240"/>
+        <w:jc w:val="center"/>
+      </w:pPr>
+      <w:r>
+        <w:t>Рисунок 9.2 — Граница регистров между слоями сети</w:t>
+      </w:r>
+    </w:p>
+    <w:p>
+      <w:pPr>
+        <w:pStyle w:val="ReportHeading2"/>
+      </w:pPr>
+      <w:r>
+        <w:t>9.3 Условия сравнения</w:t>
+      </w:r>
+    </w:p>
+    <w:p>
+      <w:pPr>
+        <w:pStyle w:val="ReportBody"/>
+      </w:pPr>
+      <w:r>
+        <w:t>Оба варианта собраны в одном проекте Vivado 2022.2 для xc7a100tcsg324-1. Измерительные верхние модули имеют одинаковый 40-битный вход, входной регистр, интерфейс valid и одни и те же параметры сети. Входы остаются переменными. Для каждого варианта выполнены синтез, размещение и трассировка при периодах 20 и 10 нс. Тактовый период ограничен соответствующим значением. Таким образом, сравнивается именно граница регистров вычислительного тракта. Выводы о таймингах относятся только к ограниченным внутренним синхронным путям.</w:t>
+      </w:r>
+    </w:p>
+    <w:p>
+      <w:pPr>
+        <w:pStyle w:val="ReportHeading1"/>
+        <w:keepNext/>
+        <w:pageBreakBefore w:val="0"/>
+      </w:pPr>
+      <w:r>
+        <w:t>10 ПРОВЕРКА И РЕЗУЛЬТАТЫ РЕАЛИЗАЦИИ</w:t>
+      </w:r>
+    </w:p>
+    <w:p>
+      <w:pPr>
+        <w:pStyle w:val="ReportHeading2"/>
+      </w:pPr>
+      <w:r>
+        <w:t>10.1 Функциональная проверка</w:t>
+      </w:r>
+    </w:p>
+    <w:p>
+      <w:pPr>
+        <w:pStyle w:val="ReportBody"/>
+      </w:pPr>
+      <w:r>
+        <w:t>Поведенческая симуляция исходного и конвейерного ядер сверила 2331 вход с программным эталоном. Для обоих измерительных верхних модулей те же 2331 ответа проверены также в функциональной симуляции после синтеза. Самопроверяющиеся прототипы прошли контрольный набор из 64 слов; тестбенчи подтвердили обнаружение намеренно изменённого эталонного бита и повторный успешный запуск. При неизменённом эталоне расхождений нет.</w:t>
       </w:r>
     </w:p>
     <w:p>
@@ -5143,7 +5818,7 @@
               <a:graphicData uri="http://schemas.openxmlformats.org/drawingml/2006/picture">
                 <pic:pic>
                   <pic:nvPicPr>
-                    <pic:cNvPr id="0" name="vivado_simulation_pass.jpg"/>
+                    <pic:cNvPr id="0" name="vivado_pr23_pipeline_pass.jpg"/>
                     <pic:cNvPicPr/>
                   </pic:nvPicPr>
                   <pic:blipFill>
@@ -5173,189 +5848,417 @@
         <w:jc w:val="center"/>
       </w:pPr>
       <w:r>
-        <w:t>Рисунок 8.1 — Результат проверки 2331 эталонного вектора в XSim</w:t>
-      </w:r>
-    </w:p>
-    <w:p>
-      <w:pPr>
-        <w:keepNext/>
-        <w:jc w:val="center"/>
-      </w:pPr>
-      <w:r>
-        <w:drawing>
-          <wp:inline xmlns:a="http://schemas.openxmlformats.org/drawingml/2006/main">
-            <wp:extent cx="5580000" cy="3487500"/>
-            <wp:docPr id="8" name="Picture 8"/>
-            <wp:cNvGraphicFramePr>
-              <a:graphicFrameLocks noChangeAspect="1"/>
-            </wp:cNvGraphicFramePr>
-            <a:graphic>
-              <a:graphicData uri="http://schemas.openxmlformats.org/drawingml/2006/picture">
-                <pic:pic>
-                  <pic:nvPicPr>
-                    <pic:cNvPr id="0" name="vivado_waveform.jpg"/>
-                    <pic:cNvPicPr/>
-                  </pic:nvPicPr>
-                  <pic:blipFill>
-                    <a:blip r:embed="rId15"/>
-                    <a:stretch>
-                      <a:fillRect/>
-                    </a:stretch>
-                  </pic:blipFill>
-                  <pic:spPr>
-                    <a:xfrm>
-                      <a:off x="0" y="0"/>
-                      <a:ext cx="5580000" cy="3487500"/>
-                    </a:xfrm>
-                    <a:prstGeom prst="rect"/>
-                  </pic:spPr>
-                </pic:pic>
-              </a:graphicData>
-            </a:graphic>
-          </wp:inline>
-        </w:drawing>
-      </w:r>
-    </w:p>
+        <w:t>Рисунок 10.1 — Сверка конвейерного классификатора с 2331 эталонным ответом в XSim</w:t>
+      </w:r>
+    </w:p>
+    <w:p>
+      <w:pPr>
+        <w:pStyle w:val="ReportHeading2"/>
+      </w:pPr>
+      <w:r>
+        <w:t>10.2 Ресурсы и временные характеристики</w:t>
+      </w:r>
+    </w:p>
+    <w:p>
+      <w:pPr>
+        <w:pStyle w:val="ReportTableCaption"/>
+      </w:pPr>
+      <w:r>
+        <w:t>Таблица 10.1 — Сравнение вычислительных трактов после трассировки</w:t>
+      </w:r>
+    </w:p>
+    <w:tbl>
+      <w:tblPr>
+        <w:tblW w:type="auto" w:w="0"/>
+        <w:tblLayout w:type="fixed"/>
+        <w:tblLook w:firstColumn="1" w:firstRow="1" w:lastColumn="0" w:lastRow="0" w:noHBand="0" w:noVBand="1" w:val="04A0"/>
+        <w:tblBorders>
+          <w:top w:val="single" w:sz="4" w:color="000000"/>
+          <w:left w:val="single" w:sz="4" w:color="000000"/>
+          <w:bottom w:val="single" w:sz="4" w:color="000000"/>
+          <w:right w:val="single" w:sz="4" w:color="000000"/>
+          <w:insideH w:val="single" w:sz="4" w:color="000000"/>
+          <w:insideV w:val="single" w:sz="4" w:color="000000"/>
+        </w:tblBorders>
+      </w:tblPr>
+      <w:tblGrid>
+        <w:gridCol w:w="2154"/>
+        <w:gridCol w:w="1587"/>
+        <w:gridCol w:w="1587"/>
+        <w:gridCol w:w="1757"/>
+        <w:gridCol w:w="1701"/>
+      </w:tblGrid>
+      <w:tr>
+        <w:tc>
+          <w:tcPr>
+            <w:tcW w:type="dxa" w:w="2154"/>
+          </w:tcPr>
+          <w:p>
+            <w:pPr>
+              <w:pStyle w:val="ReportTableText"/>
+              <w:jc w:val="center"/>
+            </w:pPr>
+            <w:r>
+              <w:rPr>
+                <w:b/>
+              </w:rPr>
+              <w:t>Вариант</w:t>
+            </w:r>
+          </w:p>
+        </w:tc>
+        <w:tc>
+          <w:tcPr>
+            <w:tcW w:type="dxa" w:w="1587"/>
+          </w:tcPr>
+          <w:p>
+            <w:pPr>
+              <w:pStyle w:val="ReportTableText"/>
+              <w:jc w:val="center"/>
+            </w:pPr>
+            <w:r>
+              <w:rPr>
+                <w:b/>
+              </w:rPr>
+              <w:t>Период, нс</w:t>
+            </w:r>
+          </w:p>
+        </w:tc>
+        <w:tc>
+          <w:tcPr>
+            <w:tcW w:type="dxa" w:w="1587"/>
+          </w:tcPr>
+          <w:p>
+            <w:pPr>
+              <w:pStyle w:val="ReportTableText"/>
+              <w:jc w:val="center"/>
+            </w:pPr>
+            <w:r>
+              <w:rPr>
+                <w:b/>
+              </w:rPr>
+              <w:t>Slice LUT</w:t>
+            </w:r>
+          </w:p>
+        </w:tc>
+        <w:tc>
+          <w:tcPr>
+            <w:tcW w:type="dxa" w:w="1757"/>
+          </w:tcPr>
+          <w:p>
+            <w:pPr>
+              <w:pStyle w:val="ReportTableText"/>
+              <w:jc w:val="center"/>
+            </w:pPr>
+            <w:r>
+              <w:rPr>
+                <w:b/>
+              </w:rPr>
+              <w:t>Регистры</w:t>
+            </w:r>
+          </w:p>
+        </w:tc>
+        <w:tc>
+          <w:tcPr>
+            <w:tcW w:type="dxa" w:w="1701"/>
+          </w:tcPr>
+          <w:p>
+            <w:pPr>
+              <w:pStyle w:val="ReportTableText"/>
+              <w:jc w:val="center"/>
+            </w:pPr>
+            <w:r>
+              <w:rPr>
+                <w:b/>
+              </w:rPr>
+              <w:t>WNS, нс</w:t>
+            </w:r>
+          </w:p>
+        </w:tc>
+      </w:tr>
+      <w:tr>
+        <w:tc>
+          <w:tcPr>
+            <w:tcW w:type="dxa" w:w="2154"/>
+          </w:tcPr>
+          <w:p>
+            <w:pPr>
+              <w:pStyle w:val="ReportTableText"/>
+            </w:pPr>
+            <w:r>
+              <w:t>Исходный</w:t>
+            </w:r>
+          </w:p>
+        </w:tc>
+        <w:tc>
+          <w:tcPr>
+            <w:tcW w:type="dxa" w:w="1587"/>
+          </w:tcPr>
+          <w:p>
+            <w:pPr>
+              <w:pStyle w:val="ReportTableText"/>
+            </w:pPr>
+            <w:r>
+              <w:t>20,000</w:t>
+            </w:r>
+          </w:p>
+        </w:tc>
+        <w:tc>
+          <w:tcPr>
+            <w:tcW w:type="dxa" w:w="1587"/>
+          </w:tcPr>
+          <w:p>
+            <w:pPr>
+              <w:pStyle w:val="ReportTableText"/>
+            </w:pPr>
+            <w:r>
+              <w:t>600</w:t>
+            </w:r>
+          </w:p>
+        </w:tc>
+        <w:tc>
+          <w:tcPr>
+            <w:tcW w:type="dxa" w:w="1757"/>
+          </w:tcPr>
+          <w:p>
+            <w:pPr>
+              <w:pStyle w:val="ReportTableText"/>
+            </w:pPr>
+            <w:r>
+              <w:t>43</w:t>
+            </w:r>
+          </w:p>
+        </w:tc>
+        <w:tc>
+          <w:tcPr>
+            <w:tcW w:type="dxa" w:w="1701"/>
+          </w:tcPr>
+          <w:p>
+            <w:pPr>
+              <w:pStyle w:val="ReportTableText"/>
+            </w:pPr>
+            <w:r>
+              <w:t>6,940</w:t>
+            </w:r>
+          </w:p>
+        </w:tc>
+      </w:tr>
+      <w:tr>
+        <w:tc>
+          <w:tcPr>
+            <w:tcW w:type="dxa" w:w="2154"/>
+          </w:tcPr>
+          <w:p>
+            <w:pPr>
+              <w:pStyle w:val="ReportTableText"/>
+            </w:pPr>
+            <w:r>
+              <w:t>С регистром</w:t>
+            </w:r>
+          </w:p>
+        </w:tc>
+        <w:tc>
+          <w:tcPr>
+            <w:tcW w:type="dxa" w:w="1587"/>
+          </w:tcPr>
+          <w:p>
+            <w:pPr>
+              <w:pStyle w:val="ReportTableText"/>
+            </w:pPr>
+            <w:r>
+              <w:t>20,000</w:t>
+            </w:r>
+          </w:p>
+        </w:tc>
+        <w:tc>
+          <w:tcPr>
+            <w:tcW w:type="dxa" w:w="1587"/>
+          </w:tcPr>
+          <w:p>
+            <w:pPr>
+              <w:pStyle w:val="ReportTableText"/>
+            </w:pPr>
+            <w:r>
+              <w:t>599</w:t>
+            </w:r>
+          </w:p>
+        </w:tc>
+        <w:tc>
+          <w:tcPr>
+            <w:tcW w:type="dxa" w:w="1757"/>
+          </w:tcPr>
+          <w:p>
+            <w:pPr>
+              <w:pStyle w:val="ReportTableText"/>
+            </w:pPr>
+            <w:r>
+              <w:t>52</w:t>
+            </w:r>
+          </w:p>
+        </w:tc>
+        <w:tc>
+          <w:tcPr>
+            <w:tcW w:type="dxa" w:w="1701"/>
+          </w:tcPr>
+          <w:p>
+            <w:pPr>
+              <w:pStyle w:val="ReportTableText"/>
+            </w:pPr>
+            <w:r>
+              <w:t>9,667</w:t>
+            </w:r>
+          </w:p>
+        </w:tc>
+      </w:tr>
+      <w:tr>
+        <w:tc>
+          <w:tcPr>
+            <w:tcW w:type="dxa" w:w="2154"/>
+          </w:tcPr>
+          <w:p>
+            <w:pPr>
+              <w:pStyle w:val="ReportTableText"/>
+            </w:pPr>
+            <w:r>
+              <w:t>Исходный</w:t>
+            </w:r>
+          </w:p>
+        </w:tc>
+        <w:tc>
+          <w:tcPr>
+            <w:tcW w:type="dxa" w:w="1587"/>
+          </w:tcPr>
+          <w:p>
+            <w:pPr>
+              <w:pStyle w:val="ReportTableText"/>
+            </w:pPr>
+            <w:r>
+              <w:t>10,000</w:t>
+            </w:r>
+          </w:p>
+        </w:tc>
+        <w:tc>
+          <w:tcPr>
+            <w:tcW w:type="dxa" w:w="1587"/>
+          </w:tcPr>
+          <w:p>
+            <w:pPr>
+              <w:pStyle w:val="ReportTableText"/>
+            </w:pPr>
+            <w:r>
+              <w:t>613</w:t>
+            </w:r>
+          </w:p>
+        </w:tc>
+        <w:tc>
+          <w:tcPr>
+            <w:tcW w:type="dxa" w:w="1757"/>
+          </w:tcPr>
+          <w:p>
+            <w:pPr>
+              <w:pStyle w:val="ReportTableText"/>
+            </w:pPr>
+            <w:r>
+              <w:t>43</w:t>
+            </w:r>
+          </w:p>
+        </w:tc>
+        <w:tc>
+          <w:tcPr>
+            <w:tcW w:type="dxa" w:w="1701"/>
+          </w:tcPr>
+          <w:p>
+            <w:pPr>
+              <w:pStyle w:val="ReportTableText"/>
+            </w:pPr>
+            <w:r>
+              <w:t>0,055</w:t>
+            </w:r>
+          </w:p>
+        </w:tc>
+      </w:tr>
+      <w:tr>
+        <w:tc>
+          <w:tcPr>
+            <w:tcW w:type="dxa" w:w="2154"/>
+          </w:tcPr>
+          <w:p>
+            <w:pPr>
+              <w:pStyle w:val="ReportTableText"/>
+            </w:pPr>
+            <w:r>
+              <w:t>С регистром</w:t>
+            </w:r>
+          </w:p>
+        </w:tc>
+        <w:tc>
+          <w:tcPr>
+            <w:tcW w:type="dxa" w:w="1587"/>
+          </w:tcPr>
+          <w:p>
+            <w:pPr>
+              <w:pStyle w:val="ReportTableText"/>
+            </w:pPr>
+            <w:r>
+              <w:t>10,000</w:t>
+            </w:r>
+          </w:p>
+        </w:tc>
+        <w:tc>
+          <w:tcPr>
+            <w:tcW w:type="dxa" w:w="1587"/>
+          </w:tcPr>
+          <w:p>
+            <w:pPr>
+              <w:pStyle w:val="ReportTableText"/>
+            </w:pPr>
+            <w:r>
+              <w:t>599</w:t>
+            </w:r>
+          </w:p>
+        </w:tc>
+        <w:tc>
+          <w:tcPr>
+            <w:tcW w:type="dxa" w:w="1757"/>
+          </w:tcPr>
+          <w:p>
+            <w:pPr>
+              <w:pStyle w:val="ReportTableText"/>
+            </w:pPr>
+            <w:r>
+              <w:t>52</w:t>
+            </w:r>
+          </w:p>
+        </w:tc>
+        <w:tc>
+          <w:tcPr>
+            <w:tcW w:type="dxa" w:w="1701"/>
+          </w:tcPr>
+          <w:p>
+            <w:pPr>
+              <w:pStyle w:val="ReportTableText"/>
+            </w:pPr>
+            <w:r>
+              <w:t>1,016</w:t>
+            </w:r>
+          </w:p>
+        </w:tc>
+      </w:tr>
+    </w:tbl>
     <w:p>
       <w:pPr>
         <w:pStyle w:val="ReportBody"/>
-        <w:spacing w:after="240"/>
-        <w:jc w:val="center"/>
-      </w:pPr>
-      <w:r>
-        <w:t>Рисунок 8.2 — Временные диаграммы входов и выходов классификатора</w:t>
-      </w:r>
-    </w:p>
-    <w:p>
-      <w:pPr>
-        <w:keepNext/>
-        <w:jc w:val="center"/>
-      </w:pPr>
-      <w:r>
-        <w:drawing>
-          <wp:inline xmlns:a="http://schemas.openxmlformats.org/drawingml/2006/main">
-            <wp:extent cx="5580000" cy="3487500"/>
-            <wp:docPr id="9" name="Picture 9"/>
-            <wp:cNvGraphicFramePr>
-              <a:graphicFrameLocks noChangeAspect="1"/>
-            </wp:cNvGraphicFramePr>
-            <a:graphic>
-              <a:graphicData uri="http://schemas.openxmlformats.org/drawingml/2006/picture">
-                <pic:pic>
-                  <pic:nvPicPr>
-                    <pic:cNvPr id="0" name="vivado_synthesized_schematic.jpg"/>
-                    <pic:cNvPicPr/>
-                  </pic:nvPicPr>
-                  <pic:blipFill>
-                    <a:blip r:embed="rId16"/>
-                    <a:stretch>
-                      <a:fillRect/>
-                    </a:stretch>
-                  </pic:blipFill>
-                  <pic:spPr>
-                    <a:xfrm>
-                      <a:off x="0" y="0"/>
-                      <a:ext cx="5580000" cy="3487500"/>
-                    </a:xfrm>
-                    <a:prstGeom prst="rect"/>
-                  </pic:spPr>
-                </pic:pic>
-              </a:graphicData>
-            </a:graphic>
-          </wp:inline>
-        </w:drawing>
-      </w:r>
-    </w:p>
-    <w:p>
-      <w:pPr>
-        <w:pStyle w:val="ReportBody"/>
-        <w:spacing w:after="240"/>
-        <w:jc w:val="center"/>
-      </w:pPr>
-      <w:r>
-        <w:t>Рисунок 8.3 — Синтезированная логическая схема классификатора</w:t>
-      </w:r>
-    </w:p>
-    <w:p>
-      <w:pPr>
-        <w:keepNext/>
-        <w:jc w:val="center"/>
-      </w:pPr>
-      <w:r>
-        <w:drawing>
-          <wp:inline xmlns:a="http://schemas.openxmlformats.org/drawingml/2006/main">
-            <wp:extent cx="5580000" cy="3487500"/>
-            <wp:docPr id="10" name="Picture 10"/>
-            <wp:cNvGraphicFramePr>
-              <a:graphicFrameLocks noChangeAspect="1"/>
-            </wp:cNvGraphicFramePr>
-            <a:graphic>
-              <a:graphicData uri="http://schemas.openxmlformats.org/drawingml/2006/picture">
-                <pic:pic>
-                  <pic:nvPicPr>
-                    <pic:cNvPr id="0" name="vivado_utilization.jpg"/>
-                    <pic:cNvPicPr/>
-                  </pic:nvPicPr>
-                  <pic:blipFill>
-                    <a:blip r:embed="rId17"/>
-                    <a:stretch>
-                      <a:fillRect/>
-                    </a:stretch>
-                  </pic:blipFill>
-                  <pic:spPr>
-                    <a:xfrm>
-                      <a:off x="0" y="0"/>
-                      <a:ext cx="5580000" cy="3487500"/>
-                    </a:xfrm>
-                    <a:prstGeom prst="rect"/>
-                  </pic:spPr>
-                </pic:pic>
-              </a:graphicData>
-            </a:graphic>
-          </wp:inline>
-        </w:drawing>
-      </w:r>
-    </w:p>
-    <w:p>
-      <w:pPr>
-        <w:pStyle w:val="ReportBody"/>
-        <w:spacing w:after="240"/>
-        <w:jc w:val="center"/>
-      </w:pPr>
-      <w:r>
-        <w:t>Рисунок 8.4 — Фрагмент схемы и ресурсы после синтеза</w:t>
-      </w:r>
-    </w:p>
-    <w:p>
-      <w:pPr>
-        <w:pStyle w:val="ReportHeading1"/>
-      </w:pPr>
-      <w:r>
-        <w:t>9 ПРОТОТИП НА ПЛИС</w:t>
-      </w:r>
-    </w:p>
-    <w:p>
-      <w:pPr>
-        <w:pStyle w:val="ReportHeading2"/>
-      </w:pPr>
-      <w:r>
-        <w:t>9.1 Состав прототипа и интерфейс</w:t>
-      </w:r>
-    </w:p>
-    <w:p>
-      <w:pPr>
-        <w:pStyle w:val="ReportBody"/>
-      </w:pPr>
-      <w:r>
-        <w:t>Верхний модуль fpga_top соединяет неизменённый RTL-классификатор с постоянным набором из 64 входных слов и 64 ожидаемых ответов. Набор включает 32 примера падения и 32 примера обычной активности. Входы и эталонные биты загружаются в память при инициализации. После импульса start автомат последовательно подаёт каждый вектор на классификатор и сверяет зарегистрированный ответ с эталоном. На один вектор приходятся два такта: подача и проверка. После последней проверки устанавливаются done и pass, а счётчики checked_count и error_count показывают объём проверки и число расхождений. Повторный импульс start начинает новый прогон.</w:t>
+      </w:pPr>
+      <w:r>
+        <w:t>При периоде 20 нс запас по установке вырос с 6,940 до 9,667 нс (на 2,727 нс). При периоде 10 нс оба варианта выдержали ограничение: WNS составил 0,055 и 1,016 нс соответственно. При одинаковом периоде оба ядра принимают один вектор каждый такт. Промежуточный регистр добавил девять триггеров и один такт задержки отдельного ответа. Преимущество конвейера здесь — запас по таймингу, а не увеличение числа ответов за такт. Оба варианта прошли 10 нс (100 МГц) на ограниченных внутренних путях; точная предельная частота по этим двум прогонам не определена.</w:t>
       </w:r>
     </w:p>
     <w:p>
       <w:pPr>
         <w:pStyle w:val="ReportTableCaption"/>
-      </w:pPr>
-      <w:r>
-        <w:t>Таблица 9.1 — Внешние сигналы прототипа</w:t>
+        <w:pageBreakBefore/>
+      </w:pPr>
+      <w:r>
+        <w:t>Таблица 10.2 — Результаты прототипов с контрольной памятью</w:t>
       </w:r>
     </w:p>
     <w:tbl>
@@ -5374,8 +6277,10 @@
       </w:tblPr>
       <w:tblGrid>
         <w:gridCol w:w="2835"/>
-        <w:gridCol w:w="1587"/>
-        <w:gridCol w:w="4365"/>
+        <w:gridCol w:w="907"/>
+        <w:gridCol w:w="1417"/>
+        <w:gridCol w:w="1928"/>
+        <w:gridCol w:w="1701"/>
       </w:tblGrid>
       <w:tr>
         <w:tc>
@@ -5391,13 +6296,13 @@
               <w:rPr>
                 <w:b/>
               </w:rPr>
-              <w:t>Сигнал</w:t>
-            </w:r>
-          </w:p>
-        </w:tc>
-        <w:tc>
-          <w:tcPr>
-            <w:tcW w:type="dxa" w:w="1587"/>
+              <w:t>Верхний модуль</w:t>
+            </w:r>
+          </w:p>
+        </w:tc>
+        <w:tc>
+          <w:tcPr>
+            <w:tcW w:type="dxa" w:w="907"/>
           </w:tcPr>
           <w:p>
             <w:pPr>
@@ -5408,13 +6313,13 @@
               <w:rPr>
                 <w:b/>
               </w:rPr>
-              <w:t>Разрядность</w:t>
-            </w:r>
-          </w:p>
-        </w:tc>
-        <w:tc>
-          <w:tcPr>
-            <w:tcW w:type="dxa" w:w="4365"/>
+              <w:t>LUT</w:t>
+            </w:r>
+          </w:p>
+        </w:tc>
+        <w:tc>
+          <w:tcPr>
+            <w:tcW w:type="dxa" w:w="1417"/>
           </w:tcPr>
           <w:p>
             <w:pPr>
@@ -5425,512 +6330,13 @@
               <w:rPr>
                 <w:b/>
               </w:rPr>
-              <w:t>Назначение</w:t>
-            </w:r>
-          </w:p>
-        </w:tc>
-      </w:tr>
-      <w:tr>
-        <w:tc>
-          <w:tcPr>
-            <w:tcW w:type="dxa" w:w="2835"/>
-          </w:tcPr>
-          <w:p>
-            <w:pPr>
-              <w:pStyle w:val="ReportTableText"/>
-            </w:pPr>
-            <w:r>
-              <w:t>clk, rst_n</w:t>
-            </w:r>
-          </w:p>
-        </w:tc>
-        <w:tc>
-          <w:tcPr>
-            <w:tcW w:type="dxa" w:w="1587"/>
-          </w:tcPr>
-          <w:p>
-            <w:pPr>
-              <w:pStyle w:val="ReportTableText"/>
-            </w:pPr>
-            <w:r>
-              <w:t>1 + 1</w:t>
-            </w:r>
-          </w:p>
-        </w:tc>
-        <w:tc>
-          <w:tcPr>
-            <w:tcW w:type="dxa" w:w="4365"/>
-          </w:tcPr>
-          <w:p>
-            <w:pPr>
-              <w:pStyle w:val="ReportTableText"/>
-            </w:pPr>
-            <w:r>
-              <w:t>Тактирование и синхронный сброс</w:t>
-            </w:r>
-          </w:p>
-        </w:tc>
-      </w:tr>
-      <w:tr>
-        <w:tc>
-          <w:tcPr>
-            <w:tcW w:type="dxa" w:w="2835"/>
-          </w:tcPr>
-          <w:p>
-            <w:pPr>
-              <w:pStyle w:val="ReportTableText"/>
-            </w:pPr>
-            <w:r>
-              <w:t>start</w:t>
-            </w:r>
-          </w:p>
-        </w:tc>
-        <w:tc>
-          <w:tcPr>
-            <w:tcW w:type="dxa" w:w="1587"/>
-          </w:tcPr>
-          <w:p>
-            <w:pPr>
-              <w:pStyle w:val="ReportTableText"/>
-            </w:pPr>
-            <w:r>
-              <w:t>1</w:t>
-            </w:r>
-          </w:p>
-        </w:tc>
-        <w:tc>
-          <w:tcPr>
-            <w:tcW w:type="dxa" w:w="4365"/>
-          </w:tcPr>
-          <w:p>
-            <w:pPr>
-              <w:pStyle w:val="ReportTableText"/>
-            </w:pPr>
-            <w:r>
-              <w:t>Импульс запуска контрольного прогона</w:t>
-            </w:r>
-          </w:p>
-        </w:tc>
-      </w:tr>
-      <w:tr>
-        <w:tc>
-          <w:tcPr>
-            <w:tcW w:type="dxa" w:w="2835"/>
-          </w:tcPr>
-          <w:p>
-            <w:pPr>
-              <w:pStyle w:val="ReportTableText"/>
-            </w:pPr>
-            <w:r>
-              <w:t>busy, done, pass</w:t>
-            </w:r>
-          </w:p>
-        </w:tc>
-        <w:tc>
-          <w:tcPr>
-            <w:tcW w:type="dxa" w:w="1587"/>
-          </w:tcPr>
-          <w:p>
-            <w:pPr>
-              <w:pStyle w:val="ReportTableText"/>
-            </w:pPr>
-            <w:r>
-              <w:t>1 + 1 + 1</w:t>
-            </w:r>
-          </w:p>
-        </w:tc>
-        <w:tc>
-          <w:tcPr>
-            <w:tcW w:type="dxa" w:w="4365"/>
-          </w:tcPr>
-          <w:p>
-            <w:pPr>
-              <w:pStyle w:val="ReportTableText"/>
-            </w:pPr>
-            <w:r>
-              <w:t>Ход, завершение и результат проверки</w:t>
-            </w:r>
-          </w:p>
-        </w:tc>
-      </w:tr>
-      <w:tr>
-        <w:tc>
-          <w:tcPr>
-            <w:tcW w:type="dxa" w:w="2835"/>
-          </w:tcPr>
-          <w:p>
-            <w:pPr>
-              <w:pStyle w:val="ReportTableText"/>
-            </w:pPr>
-            <w:r>
-              <w:t>checked_count, error_count</w:t>
-            </w:r>
-          </w:p>
-        </w:tc>
-        <w:tc>
-          <w:tcPr>
-            <w:tcW w:type="dxa" w:w="1587"/>
-          </w:tcPr>
-          <w:p>
-            <w:pPr>
-              <w:pStyle w:val="ReportTableText"/>
-            </w:pPr>
-            <w:r>
-              <w:t>7 + 7</w:t>
-            </w:r>
-          </w:p>
-        </w:tc>
-        <w:tc>
-          <w:tcPr>
-            <w:tcW w:type="dxa" w:w="4365"/>
-          </w:tcPr>
-          <w:p>
-            <w:pPr>
-              <w:pStyle w:val="ReportTableText"/>
-            </w:pPr>
-            <w:r>
-              <w:t>Число проверенных векторов и расхождений</w:t>
-            </w:r>
-          </w:p>
-        </w:tc>
-      </w:tr>
-      <w:tr>
-        <w:tc>
-          <w:tcPr>
-            <w:tcW w:type="dxa" w:w="2835"/>
-          </w:tcPr>
-          <w:p>
-            <w:pPr>
-              <w:pStyle w:val="ReportTableText"/>
-            </w:pPr>
-            <w:r>
-              <w:t>last_prediction</w:t>
-            </w:r>
-          </w:p>
-        </w:tc>
-        <w:tc>
-          <w:tcPr>
-            <w:tcW w:type="dxa" w:w="1587"/>
-          </w:tcPr>
-          <w:p>
-            <w:pPr>
-              <w:pStyle w:val="ReportTableText"/>
-            </w:pPr>
-            <w:r>
-              <w:t>1</w:t>
-            </w:r>
-          </w:p>
-        </w:tc>
-        <w:tc>
-          <w:tcPr>
-            <w:tcW w:type="dxa" w:w="4365"/>
-          </w:tcPr>
-          <w:p>
-            <w:pPr>
-              <w:pStyle w:val="ReportTableText"/>
-            </w:pPr>
-            <w:r>
-              <w:t>Последний ответ классификатора</w:t>
-            </w:r>
-          </w:p>
-        </w:tc>
-      </w:tr>
-    </w:tbl>
-    <w:p>
-      <w:pPr>
-        <w:pStyle w:val="ReportBody"/>
-      </w:pPr>
-      <w:r>
-        <w:t>Структура реализованного верхнего уровня приведена на рисунке 9.1. Внутри него находится тот же вычислительный тракт 5→8→1, который проверен в практической работе № 2; дополнительная логика выполняет подачу контрольных данных и самопроверку.</w:t>
-      </w:r>
-    </w:p>
-    <w:p>
-      <w:pPr>
-        <w:keepNext/>
-        <w:jc w:val="center"/>
-      </w:pPr>
-      <w:r>
-        <w:drawing>
-          <wp:inline xmlns:a="http://schemas.openxmlformats.org/drawingml/2006/main">
-            <wp:extent cx="5580000" cy="3487500"/>
-            <wp:docPr id="11" name="Picture 11"/>
-            <wp:cNvGraphicFramePr>
-              <a:graphicFrameLocks noChangeAspect="1"/>
-            </wp:cNvGraphicFramePr>
-            <a:graphic>
-              <a:graphicData uri="http://schemas.openxmlformats.org/drawingml/2006/picture">
-                <pic:pic>
-                  <pic:nvPicPr>
-                    <pic:cNvPr id="0" name="vivado_pr3_schematic.jpg"/>
-                    <pic:cNvPicPr/>
-                  </pic:nvPicPr>
-                  <pic:blipFill>
-                    <a:blip r:embed="rId18"/>
-                    <a:stretch>
-                      <a:fillRect/>
-                    </a:stretch>
-                  </pic:blipFill>
-                  <pic:spPr>
-                    <a:xfrm>
-                      <a:off x="0" y="0"/>
-                      <a:ext cx="5580000" cy="3487500"/>
-                    </a:xfrm>
-                    <a:prstGeom prst="rect"/>
-                  </pic:spPr>
-                </pic:pic>
-              </a:graphicData>
-            </a:graphic>
-          </wp:inline>
-        </w:drawing>
-      </w:r>
-    </w:p>
-    <w:p>
-      <w:pPr>
-        <w:pStyle w:val="ReportBody"/>
-        <w:spacing w:after="240"/>
-        <w:jc w:val="center"/>
-      </w:pPr>
-      <w:r>
-        <w:t>Рисунок 9.1 — Логическая схема верхнего уровня после реализации</w:t>
-      </w:r>
-    </w:p>
-    <w:p>
-      <w:pPr>
-        <w:pStyle w:val="ReportHeading2"/>
-      </w:pPr>
-      <w:r>
-        <w:t>9.2 Ограничения и физическая реализация</w:t>
-      </w:r>
-    </w:p>
-    <w:p>
-      <w:pPr>
-        <w:pStyle w:val="ReportBody"/>
-      </w:pPr>
-      <w:r>
-        <w:t>Проект bnn_pr3 реализован в Vivado 2022.2 для Artix-7 xc7a100tcsg324-1. Ограничение create_clock задаёт период 20 нс (расчётную частоту 50 МГц). После синтеза выполнены оптимизация, размещение и трассировка. Окно Device с размещёнными элементами показано на рисунке 9.2. Это результат реализации для выбранного кристалла; физические контакты конкретной отладочной платы не назначались.</w:t>
-      </w:r>
-    </w:p>
-    <w:p>
-      <w:pPr>
-        <w:keepNext/>
-        <w:jc w:val="center"/>
-      </w:pPr>
-      <w:r>
-        <w:drawing>
-          <wp:inline xmlns:a="http://schemas.openxmlformats.org/drawingml/2006/main">
-            <wp:extent cx="5580000" cy="3487500"/>
-            <wp:docPr id="12" name="Picture 12"/>
-            <wp:cNvGraphicFramePr>
-              <a:graphicFrameLocks noChangeAspect="1"/>
-            </wp:cNvGraphicFramePr>
-            <a:graphic>
-              <a:graphicData uri="http://schemas.openxmlformats.org/drawingml/2006/picture">
-                <pic:pic>
-                  <pic:nvPicPr>
-                    <pic:cNvPr id="0" name="vivado_pr3_device_full.jpg"/>
-                    <pic:cNvPicPr/>
-                  </pic:nvPicPr>
-                  <pic:blipFill>
-                    <a:blip r:embed="rId19"/>
-                    <a:stretch>
-                      <a:fillRect/>
-                    </a:stretch>
-                  </pic:blipFill>
-                  <pic:spPr>
-                    <a:xfrm>
-                      <a:off x="0" y="0"/>
-                      <a:ext cx="5580000" cy="3487500"/>
-                    </a:xfrm>
-                    <a:prstGeom prst="rect"/>
-                  </pic:spPr>
-                </pic:pic>
-              </a:graphicData>
-            </a:graphic>
-          </wp:inline>
-        </w:drawing>
-      </w:r>
-    </w:p>
-    <w:p>
-      <w:pPr>
-        <w:pStyle w:val="ReportBody"/>
-        <w:spacing w:after="240"/>
-        <w:jc w:val="center"/>
-      </w:pPr>
-      <w:r>
-        <w:t>Рисунок 9.2 — Размещение прототипа на кристалле в Vivado</w:t>
-      </w:r>
-    </w:p>
-    <w:p>
-      <w:pPr>
-        <w:pStyle w:val="ReportBody"/>
-      </w:pPr>
-      <w:r>
-        <w:t>Отчёт маршрутизации зафиксировал 760 трассируемых цепей; все 760 проложены, ошибок маршрутизации 0. Таким образом, логические соединения схемы физически проложены средствами Vivado. Итоговый статус синтеза и реализации показан на рисунке 9.3.</w:t>
-      </w:r>
-    </w:p>
-    <w:p>
-      <w:pPr>
-        <w:keepNext/>
-        <w:jc w:val="center"/>
-      </w:pPr>
-      <w:r>
-        <w:drawing>
-          <wp:inline xmlns:a="http://schemas.openxmlformats.org/drawingml/2006/main">
-            <wp:extent cx="5580000" cy="3487500"/>
-            <wp:docPr id="13" name="Picture 13"/>
-            <wp:cNvGraphicFramePr>
-              <a:graphicFrameLocks noChangeAspect="1"/>
-            </wp:cNvGraphicFramePr>
-            <a:graphic>
-              <a:graphicData uri="http://schemas.openxmlformats.org/drawingml/2006/picture">
-                <pic:pic>
-                  <pic:nvPicPr>
-                    <pic:cNvPr id="0" name="vivado_pr3_statuses.jpg"/>
-                    <pic:cNvPicPr/>
-                  </pic:nvPicPr>
-                  <pic:blipFill>
-                    <a:blip r:embed="rId20"/>
-                    <a:stretch>
-                      <a:fillRect/>
-                    </a:stretch>
-                  </pic:blipFill>
-                  <pic:spPr>
-                    <a:xfrm>
-                      <a:off x="0" y="0"/>
-                      <a:ext cx="5580000" cy="3487500"/>
-                    </a:xfrm>
-                    <a:prstGeom prst="rect"/>
-                  </pic:spPr>
-                </pic:pic>
-              </a:graphicData>
-            </a:graphic>
-          </wp:inline>
-        </w:drawing>
-      </w:r>
-    </w:p>
-    <w:p>
-      <w:pPr>
-        <w:pStyle w:val="ReportBody"/>
-        <w:spacing w:after="240"/>
-        <w:jc w:val="center"/>
-      </w:pPr>
-      <w:r>
-        <w:t>Рисунок 9.3 — Завершение синтеза и реализации в Vivado</w:t>
-      </w:r>
-    </w:p>
-    <w:p>
-      <w:pPr>
-        <w:pStyle w:val="ReportHeading1"/>
-      </w:pPr>
-      <w:r>
-        <w:t>10 СИМУЛЯЦИЯ И РЕЗУЛЬТАТЫ РЕАЛИЗАЦИИ</w:t>
-      </w:r>
-    </w:p>
-    <w:p>
-      <w:pPr>
-        <w:pStyle w:val="ReportHeading2"/>
-      </w:pPr>
-      <w:r>
-        <w:t>10.1 Проверка работы верхнего модуля</w:t>
-      </w:r>
-    </w:p>
-    <w:p>
-      <w:pPr>
-        <w:pStyle w:val="ReportBody"/>
-      </w:pPr>
-      <w:r>
-        <w:t>В XSim выполнена поведенческая симуляция самопроверяющегося тестбенча tb_fpga_top. Первый запуск подтвердил совпадение всех 64 ответов с эталоном. Затем один ожидаемый бит был намеренно изменён: прототип зафиксировал одно расхождение и снял флаг pass. После восстановления эталона повторный запуск снова завершился без ошибок. Консоль XSim вывела сообщение PASS: FPGA prototype self-test; 64 vectors, error detection and restart (рисунок 10.1). Такая проверка подтверждает работу автомата подачи векторов, счётчиков и механизма обнаружения ошибок в симуляции.</w:t>
-      </w:r>
-    </w:p>
-    <w:p>
-      <w:pPr>
-        <w:keepNext/>
-        <w:jc w:val="center"/>
-      </w:pPr>
-      <w:r>
-        <w:drawing>
-          <wp:inline xmlns:a="http://schemas.openxmlformats.org/drawingml/2006/main">
-            <wp:extent cx="5580000" cy="3487500"/>
-            <wp:docPr id="14" name="Picture 14"/>
-            <wp:cNvGraphicFramePr>
-              <a:graphicFrameLocks noChangeAspect="1"/>
-            </wp:cNvGraphicFramePr>
-            <a:graphic>
-              <a:graphicData uri="http://schemas.openxmlformats.org/drawingml/2006/picture">
-                <pic:pic>
-                  <pic:nvPicPr>
-                    <pic:cNvPr id="0" name="vivado_pr3_simulation_pass.jpg"/>
-                    <pic:cNvPicPr/>
-                  </pic:nvPicPr>
-                  <pic:blipFill>
-                    <a:blip r:embed="rId21"/>
-                    <a:stretch>
-                      <a:fillRect/>
-                    </a:stretch>
-                  </pic:blipFill>
-                  <pic:spPr>
-                    <a:xfrm>
-                      <a:off x="0" y="0"/>
-                      <a:ext cx="5580000" cy="3487500"/>
-                    </a:xfrm>
-                    <a:prstGeom prst="rect"/>
-                  </pic:spPr>
-                </pic:pic>
-              </a:graphicData>
-            </a:graphic>
-          </wp:inline>
-        </w:drawing>
-      </w:r>
-    </w:p>
-    <w:p>
-      <w:pPr>
-        <w:pStyle w:val="ReportBody"/>
-        <w:spacing w:after="240"/>
-        <w:jc w:val="center"/>
-      </w:pPr>
-      <w:r>
-        <w:t>Рисунок 10.1 — Результат симуляции верхнего модуля в XSim</w:t>
-      </w:r>
-    </w:p>
-    <w:p>
-      <w:pPr>
-        <w:pStyle w:val="ReportHeading2"/>
-      </w:pPr>
-      <w:r>
-        <w:t>10.2 Ресурсы, трассировка и временные характеристики</w:t>
-      </w:r>
-    </w:p>
-    <w:p>
-      <w:pPr>
-        <w:pStyle w:val="ReportTableCaption"/>
-      </w:pPr>
-      <w:r>
-        <w:t>Таблица 10.1 — Использование ресурсов после трассировки</w:t>
-      </w:r>
-    </w:p>
-    <w:tbl>
-      <w:tblPr>
-        <w:tblW w:type="auto" w:w="0"/>
-        <w:tblLayout w:type="fixed"/>
-        <w:tblLook w:firstColumn="1" w:firstRow="1" w:lastColumn="0" w:lastRow="0" w:noHBand="0" w:noVBand="1" w:val="04A0"/>
-        <w:tblBorders>
-          <w:top w:val="single" w:sz="4" w:color="000000"/>
-          <w:left w:val="single" w:sz="4" w:color="000000"/>
-          <w:bottom w:val="single" w:sz="4" w:color="000000"/>
-          <w:right w:val="single" w:sz="4" w:color="000000"/>
-          <w:insideH w:val="single" w:sz="4" w:color="000000"/>
-          <w:insideV w:val="single" w:sz="4" w:color="000000"/>
-        </w:tblBorders>
-      </w:tblPr>
-      <w:tblGrid>
-        <w:gridCol w:w="3175"/>
-        <w:gridCol w:w="1984"/>
-        <w:gridCol w:w="3628"/>
-      </w:tblGrid>
-      <w:tr>
-        <w:tc>
-          <w:tcPr>
-            <w:tcW w:type="dxa" w:w="3175"/>
+              <w:t>Регистры</w:t>
+            </w:r>
+          </w:p>
+        </w:tc>
+        <w:tc>
+          <w:tcPr>
+            <w:tcW w:type="dxa" w:w="1928"/>
           </w:tcPr>
           <w:p>
             <w:pPr>
@@ -5941,13 +6347,13 @@
               <w:rPr>
                 <w:b/>
               </w:rPr>
-              <w:t>Ресурс</w:t>
-            </w:r>
-          </w:p>
-        </w:tc>
-        <w:tc>
-          <w:tcPr>
-            <w:tcW w:type="dxa" w:w="1984"/>
+              <w:t>Проложено цепей</w:t>
+            </w:r>
+          </w:p>
+        </w:tc>
+        <w:tc>
+          <w:tcPr>
+            <w:tcW w:type="dxa" w:w="1701"/>
           </w:tcPr>
           <w:p>
             <w:pPr>
@@ -5958,24 +6364,7 @@
               <w:rPr>
                 <w:b/>
               </w:rPr>
-              <w:t>Использовано</w:t>
-            </w:r>
-          </w:p>
-        </w:tc>
-        <w:tc>
-          <w:tcPr>
-            <w:tcW w:type="dxa" w:w="3628"/>
-          </w:tcPr>
-          <w:p>
-            <w:pPr>
-              <w:pStyle w:val="ReportTableText"/>
-              <w:jc w:val="center"/>
-            </w:pPr>
-            <w:r>
-              <w:rPr>
-                <w:b/>
-              </w:rPr>
-              <w:t>Доля доступных ресурсов</w:t>
+              <w:t>WNS при 20 нс</w:t>
             </w:r>
           </w:p>
         </w:tc>
@@ -5983,40 +6372,66 @@
       <w:tr>
         <w:tc>
           <w:tcPr>
-            <w:tcW w:type="dxa" w:w="3175"/>
-          </w:tcPr>
-          <w:p>
-            <w:pPr>
-              <w:pStyle w:val="ReportTableText"/>
-            </w:pPr>
-            <w:r>
-              <w:t>Slice LUT</w:t>
-            </w:r>
-          </w:p>
-        </w:tc>
-        <w:tc>
-          <w:tcPr>
-            <w:tcW w:type="dxa" w:w="1984"/>
-          </w:tcPr>
-          <w:p>
-            <w:pPr>
-              <w:pStyle w:val="ReportTableText"/>
-            </w:pPr>
-            <w:r>
-              <w:t>646</w:t>
-            </w:r>
-          </w:p>
-        </w:tc>
-        <w:tc>
-          <w:tcPr>
-            <w:tcW w:type="dxa" w:w="3628"/>
-          </w:tcPr>
-          <w:p>
-            <w:pPr>
-              <w:pStyle w:val="ReportTableText"/>
-            </w:pPr>
-            <w:r>
-              <w:t>1,02 %</w:t>
+            <w:tcW w:type="dxa" w:w="2835"/>
+          </w:tcPr>
+          <w:p>
+            <w:pPr>
+              <w:pStyle w:val="ReportTableText"/>
+            </w:pPr>
+            <w:r>
+              <w:t>fpga_top</w:t>
+            </w:r>
+          </w:p>
+        </w:tc>
+        <w:tc>
+          <w:tcPr>
+            <w:tcW w:type="dxa" w:w="907"/>
+          </w:tcPr>
+          <w:p>
+            <w:pPr>
+              <w:pStyle w:val="ReportTableText"/>
+            </w:pPr>
+            <w:r>
+              <w:t>649</w:t>
+            </w:r>
+          </w:p>
+        </w:tc>
+        <w:tc>
+          <w:tcPr>
+            <w:tcW w:type="dxa" w:w="1417"/>
+          </w:tcPr>
+          <w:p>
+            <w:pPr>
+              <w:pStyle w:val="ReportTableText"/>
+            </w:pPr>
+            <w:r>
+              <w:t>29</w:t>
+            </w:r>
+          </w:p>
+        </w:tc>
+        <w:tc>
+          <w:tcPr>
+            <w:tcW w:type="dxa" w:w="1928"/>
+          </w:tcPr>
+          <w:p>
+            <w:pPr>
+              <w:pStyle w:val="ReportTableText"/>
+            </w:pPr>
+            <w:r>
+              <w:t>761/761</w:t>
+            </w:r>
+          </w:p>
+        </w:tc>
+        <w:tc>
+          <w:tcPr>
+            <w:tcW w:type="dxa" w:w="1701"/>
+          </w:tcPr>
+          <w:p>
+            <w:pPr>
+              <w:pStyle w:val="ReportTableText"/>
+            </w:pPr>
+            <w:r>
+              <w:t>5,280</w:t>
             </w:r>
           </w:p>
         </w:tc>
@@ -6024,163 +6439,66 @@
       <w:tr>
         <w:tc>
           <w:tcPr>
-            <w:tcW w:type="dxa" w:w="3175"/>
-          </w:tcPr>
-          <w:p>
-            <w:pPr>
-              <w:pStyle w:val="ReportTableText"/>
-            </w:pPr>
-            <w:r>
-              <w:t>Slice Register</w:t>
-            </w:r>
-          </w:p>
-        </w:tc>
-        <w:tc>
-          <w:tcPr>
-            <w:tcW w:type="dxa" w:w="1984"/>
-          </w:tcPr>
-          <w:p>
-            <w:pPr>
-              <w:pStyle w:val="ReportTableText"/>
-            </w:pPr>
-            <w:r>
-              <w:t>29</w:t>
-            </w:r>
-          </w:p>
-        </w:tc>
-        <w:tc>
-          <w:tcPr>
-            <w:tcW w:type="dxa" w:w="3628"/>
-          </w:tcPr>
-          <w:p>
-            <w:pPr>
-              <w:pStyle w:val="ReportTableText"/>
-            </w:pPr>
-            <w:r>
-              <w:t>0,02 %</w:t>
-            </w:r>
-          </w:p>
-        </w:tc>
-      </w:tr>
-      <w:tr>
-        <w:tc>
-          <w:tcPr>
-            <w:tcW w:type="dxa" w:w="3175"/>
-          </w:tcPr>
-          <w:p>
-            <w:pPr>
-              <w:pStyle w:val="ReportTableText"/>
-            </w:pPr>
-            <w:r>
-              <w:t>Slice</w:t>
-            </w:r>
-          </w:p>
-        </w:tc>
-        <w:tc>
-          <w:tcPr>
-            <w:tcW w:type="dxa" w:w="1984"/>
-          </w:tcPr>
-          <w:p>
-            <w:pPr>
-              <w:pStyle w:val="ReportTableText"/>
-            </w:pPr>
-            <w:r>
-              <w:t>209</w:t>
-            </w:r>
-          </w:p>
-        </w:tc>
-        <w:tc>
-          <w:tcPr>
-            <w:tcW w:type="dxa" w:w="3628"/>
-          </w:tcPr>
-          <w:p>
-            <w:pPr>
-              <w:pStyle w:val="ReportTableText"/>
-            </w:pPr>
-            <w:r>
-              <w:t>1,32 %</w:t>
-            </w:r>
-          </w:p>
-        </w:tc>
-      </w:tr>
-      <w:tr>
-        <w:tc>
-          <w:tcPr>
-            <w:tcW w:type="dxa" w:w="3175"/>
-          </w:tcPr>
-          <w:p>
-            <w:pPr>
-              <w:pStyle w:val="ReportTableText"/>
-            </w:pPr>
-            <w:r>
-              <w:t>Bonded IOB</w:t>
-            </w:r>
-          </w:p>
-        </w:tc>
-        <w:tc>
-          <w:tcPr>
-            <w:tcW w:type="dxa" w:w="1984"/>
-          </w:tcPr>
-          <w:p>
-            <w:pPr>
-              <w:pStyle w:val="ReportTableText"/>
-            </w:pPr>
-            <w:r>
-              <w:t>21</w:t>
-            </w:r>
-          </w:p>
-        </w:tc>
-        <w:tc>
-          <w:tcPr>
-            <w:tcW w:type="dxa" w:w="3628"/>
-          </w:tcPr>
-          <w:p>
-            <w:pPr>
-              <w:pStyle w:val="ReportTableText"/>
-            </w:pPr>
-            <w:r>
-              <w:t>10,00 %</w:t>
-            </w:r>
-          </w:p>
-        </w:tc>
-      </w:tr>
-      <w:tr>
-        <w:tc>
-          <w:tcPr>
-            <w:tcW w:type="dxa" w:w="3175"/>
-          </w:tcPr>
-          <w:p>
-            <w:pPr>
-              <w:pStyle w:val="ReportTableText"/>
-            </w:pPr>
-            <w:r>
-              <w:t>BUFGCTRL</w:t>
-            </w:r>
-          </w:p>
-        </w:tc>
-        <w:tc>
-          <w:tcPr>
-            <w:tcW w:type="dxa" w:w="1984"/>
-          </w:tcPr>
-          <w:p>
-            <w:pPr>
-              <w:pStyle w:val="ReportTableText"/>
-            </w:pPr>
-            <w:r>
-              <w:t>1</w:t>
-            </w:r>
-          </w:p>
-        </w:tc>
-        <w:tc>
-          <w:tcPr>
-            <w:tcW w:type="dxa" w:w="3628"/>
-          </w:tcPr>
-          <w:p>
-            <w:pPr>
-              <w:pStyle w:val="ReportTableText"/>
-            </w:pPr>
-            <w:r>
-              <w:t>3,13 %</w:t>
+            <w:tcW w:type="dxa" w:w="2835"/>
+          </w:tcPr>
+          <w:p>
+            <w:pPr>
+              <w:pStyle w:val="ReportTableText"/>
+            </w:pPr>
+            <w:r>
+              <w:t>fpga_top_pipelined</w:t>
+            </w:r>
+          </w:p>
+        </w:tc>
+        <w:tc>
+          <w:tcPr>
+            <w:tcW w:type="dxa" w:w="907"/>
+          </w:tcPr>
+          <w:p>
+            <w:pPr>
+              <w:pStyle w:val="ReportTableText"/>
+            </w:pPr>
+            <w:r>
+              <w:t>653</w:t>
+            </w:r>
+          </w:p>
+        </w:tc>
+        <w:tc>
+          <w:tcPr>
+            <w:tcW w:type="dxa" w:w="1417"/>
+          </w:tcPr>
+          <w:p>
+            <w:pPr>
+              <w:pStyle w:val="ReportTableText"/>
+            </w:pPr>
+            <w:r>
+              <w:t>49</w:t>
+            </w:r>
+          </w:p>
+        </w:tc>
+        <w:tc>
+          <w:tcPr>
+            <w:tcW w:type="dxa" w:w="1928"/>
+          </w:tcPr>
+          <w:p>
+            <w:pPr>
+              <w:pStyle w:val="ReportTableText"/>
+            </w:pPr>
+            <w:r>
+              <w:t>777/777</w:t>
+            </w:r>
+          </w:p>
+        </w:tc>
+        <w:tc>
+          <w:tcPr>
+            <w:tcW w:type="dxa" w:w="1701"/>
+          </w:tcPr>
+          <w:p>
+            <w:pPr>
+              <w:pStyle w:val="ReportTableText"/>
+            </w:pPr>
+            <w:r>
+              <w:t>6,999</w:t>
             </w:r>
           </w:p>
         </w:tc>
@@ -6191,309 +6509,23 @@
         <w:pStyle w:val="ReportBody"/>
       </w:pPr>
       <w:r>
-        <w:t>Ресурсы относятся к верхнему модулю с автоматом самопроверки и встроенным контрольным набором; их нельзя напрямую сопоставлять с оценкой отдельного классификатора после синтеза в разделе 8. Память контрольных данных и весов оптимизирована в логические ресурсы; блоков BRAM использовано 0, блоков DSP — 0.</w:t>
-      </w:r>
-    </w:p>
-    <w:p>
-      <w:pPr>
-        <w:pStyle w:val="ReportTableCaption"/>
-      </w:pPr>
-      <w:r>
-        <w:t>Таблица 10.2 — Результаты трассировки и анализа таймингов</w:t>
-      </w:r>
-    </w:p>
-    <w:tbl>
-      <w:tblPr>
-        <w:tblW w:type="auto" w:w="0"/>
-        <w:tblLayout w:type="fixed"/>
-        <w:tblLook w:firstColumn="1" w:firstRow="1" w:lastColumn="0" w:lastRow="0" w:noHBand="0" w:noVBand="1" w:val="04A0"/>
-        <w:tblBorders>
-          <w:top w:val="single" w:sz="4" w:color="000000"/>
-          <w:left w:val="single" w:sz="4" w:color="000000"/>
-          <w:bottom w:val="single" w:sz="4" w:color="000000"/>
-          <w:right w:val="single" w:sz="4" w:color="000000"/>
-          <w:insideH w:val="single" w:sz="4" w:color="000000"/>
-          <w:insideV w:val="single" w:sz="4" w:color="000000"/>
-        </w:tblBorders>
-      </w:tblPr>
-      <w:tblGrid>
-        <w:gridCol w:w="3288"/>
-        <w:gridCol w:w="1701"/>
-        <w:gridCol w:w="3798"/>
-      </w:tblGrid>
-      <w:tr>
-        <w:tc>
-          <w:tcPr>
-            <w:tcW w:type="dxa" w:w="3288"/>
-          </w:tcPr>
-          <w:p>
-            <w:pPr>
-              <w:pStyle w:val="ReportTableText"/>
-              <w:jc w:val="center"/>
-            </w:pPr>
-            <w:r>
-              <w:rPr>
-                <w:b/>
-              </w:rPr>
-              <w:t>Показатель</w:t>
-            </w:r>
-          </w:p>
-        </w:tc>
-        <w:tc>
-          <w:tcPr>
-            <w:tcW w:type="dxa" w:w="1701"/>
-          </w:tcPr>
-          <w:p>
-            <w:pPr>
-              <w:pStyle w:val="ReportTableText"/>
-              <w:jc w:val="center"/>
-            </w:pPr>
-            <w:r>
-              <w:rPr>
-                <w:b/>
-              </w:rPr>
-              <w:t>Значение</w:t>
-            </w:r>
-          </w:p>
-        </w:tc>
-        <w:tc>
-          <w:tcPr>
-            <w:tcW w:type="dxa" w:w="3798"/>
-          </w:tcPr>
-          <w:p>
-            <w:pPr>
-              <w:pStyle w:val="ReportTableText"/>
-              <w:jc w:val="center"/>
-            </w:pPr>
-            <w:r>
-              <w:rPr>
-                <w:b/>
-              </w:rPr>
-              <w:t>Смысл</w:t>
-            </w:r>
-          </w:p>
-        </w:tc>
-      </w:tr>
-      <w:tr>
-        <w:tc>
-          <w:tcPr>
-            <w:tcW w:type="dxa" w:w="3288"/>
-          </w:tcPr>
-          <w:p>
-            <w:pPr>
-              <w:pStyle w:val="ReportTableText"/>
-            </w:pPr>
-            <w:r>
-              <w:t>Трассируемые / проложенные цепи</w:t>
-            </w:r>
-          </w:p>
-        </w:tc>
-        <w:tc>
-          <w:tcPr>
-            <w:tcW w:type="dxa" w:w="1701"/>
-          </w:tcPr>
-          <w:p>
-            <w:pPr>
-              <w:pStyle w:val="ReportTableText"/>
-            </w:pPr>
-            <w:r>
-              <w:t>760 / 760</w:t>
-            </w:r>
-          </w:p>
-        </w:tc>
-        <w:tc>
-          <w:tcPr>
-            <w:tcW w:type="dxa" w:w="3798"/>
-          </w:tcPr>
-          <w:p>
-            <w:pPr>
-              <w:pStyle w:val="ReportTableText"/>
-            </w:pPr>
-            <w:r>
-              <w:t>Все трассируемые цепи проложены</w:t>
-            </w:r>
-          </w:p>
-        </w:tc>
-      </w:tr>
-      <w:tr>
-        <w:tc>
-          <w:tcPr>
-            <w:tcW w:type="dxa" w:w="3288"/>
-          </w:tcPr>
-          <w:p>
-            <w:pPr>
-              <w:pStyle w:val="ReportTableText"/>
-            </w:pPr>
-            <w:r>
-              <w:t>Ошибки маршрутизации</w:t>
-            </w:r>
-          </w:p>
-        </w:tc>
-        <w:tc>
-          <w:tcPr>
-            <w:tcW w:type="dxa" w:w="1701"/>
-          </w:tcPr>
-          <w:p>
-            <w:pPr>
-              <w:pStyle w:val="ReportTableText"/>
-            </w:pPr>
-            <w:r>
-              <w:t>0</w:t>
-            </w:r>
-          </w:p>
-        </w:tc>
-        <w:tc>
-          <w:tcPr>
-            <w:tcW w:type="dxa" w:w="3798"/>
-          </w:tcPr>
-          <w:p>
-            <w:pPr>
-              <w:pStyle w:val="ReportTableText"/>
-            </w:pPr>
-            <w:r>
-              <w:t>Ошибок нет</w:t>
-            </w:r>
-          </w:p>
-        </w:tc>
-      </w:tr>
-      <w:tr>
-        <w:tc>
-          <w:tcPr>
-            <w:tcW w:type="dxa" w:w="3288"/>
-          </w:tcPr>
-          <w:p>
-            <w:pPr>
-              <w:pStyle w:val="ReportTableText"/>
-            </w:pPr>
-            <w:r>
-              <w:t>Период clk</w:t>
-            </w:r>
-          </w:p>
-        </w:tc>
-        <w:tc>
-          <w:tcPr>
-            <w:tcW w:type="dxa" w:w="1701"/>
-          </w:tcPr>
-          <w:p>
-            <w:pPr>
-              <w:pStyle w:val="ReportTableText"/>
-            </w:pPr>
-            <w:r>
-              <w:t>20,000 нс</w:t>
-            </w:r>
-          </w:p>
-        </w:tc>
-        <w:tc>
-          <w:tcPr>
-            <w:tcW w:type="dxa" w:w="3798"/>
-          </w:tcPr>
-          <w:p>
-            <w:pPr>
-              <w:pStyle w:val="ReportTableText"/>
-            </w:pPr>
-            <w:r>
-              <w:t>Расчётная цель 50 МГц</w:t>
-            </w:r>
-          </w:p>
-        </w:tc>
-      </w:tr>
-      <w:tr>
-        <w:tc>
-          <w:tcPr>
-            <w:tcW w:type="dxa" w:w="3288"/>
-          </w:tcPr>
-          <w:p>
-            <w:pPr>
-              <w:pStyle w:val="ReportTableText"/>
-            </w:pPr>
-            <w:r>
-              <w:t>WNS / TNS</w:t>
-            </w:r>
-          </w:p>
-        </w:tc>
-        <w:tc>
-          <w:tcPr>
-            <w:tcW w:type="dxa" w:w="1701"/>
-          </w:tcPr>
-          <w:p>
-            <w:pPr>
-              <w:pStyle w:val="ReportTableText"/>
-            </w:pPr>
-            <w:r>
-              <w:t>+5,270 нс / 0 нс</w:t>
-            </w:r>
-          </w:p>
-        </w:tc>
-        <w:tc>
-          <w:tcPr>
-            <w:tcW w:type="dxa" w:w="3798"/>
-          </w:tcPr>
-          <w:p>
-            <w:pPr>
-              <w:pStyle w:val="ReportTableText"/>
-            </w:pPr>
-            <w:r>
-              <w:t>Нарушений setup нет</w:t>
-            </w:r>
-          </w:p>
-        </w:tc>
-      </w:tr>
-      <w:tr>
-        <w:tc>
-          <w:tcPr>
-            <w:tcW w:type="dxa" w:w="3288"/>
-          </w:tcPr>
-          <w:p>
-            <w:pPr>
-              <w:pStyle w:val="ReportTableText"/>
-            </w:pPr>
-            <w:r>
-              <w:t>WHS / THS</w:t>
-            </w:r>
-          </w:p>
-        </w:tc>
-        <w:tc>
-          <w:tcPr>
-            <w:tcW w:type="dxa" w:w="1701"/>
-          </w:tcPr>
-          <w:p>
-            <w:pPr>
-              <w:pStyle w:val="ReportTableText"/>
-            </w:pPr>
-            <w:r>
-              <w:t>+0,189 нс / 0 нс</w:t>
-            </w:r>
-          </w:p>
-        </w:tc>
-        <w:tc>
-          <w:tcPr>
-            <w:tcW w:type="dxa" w:w="3798"/>
-          </w:tcPr>
-          <w:p>
-            <w:pPr>
-              <w:pStyle w:val="ReportTableText"/>
-            </w:pPr>
-            <w:r>
-              <w:t>Нарушений hold нет</w:t>
-            </w:r>
-          </w:p>
-        </w:tc>
-      </w:tr>
-    </w:tbl>
+        <w:t>Оба прототипа полностью трассированы без ошибок маршрутизации. Эти значения включают автомат и постоянную контрольную память. Они характеризуют верхние модули, но не служат основанием для вывода о скорости вычислительного ядра.</w:t>
+      </w:r>
+    </w:p>
+    <w:p>
+      <w:pPr>
+        <w:pStyle w:val="ReportHeading2"/>
+      </w:pPr>
+      <w:r>
+        <w:t>10.3 Границы проверки</w:t>
+      </w:r>
+    </w:p>
     <w:p>
       <w:pPr>
         <w:pStyle w:val="ReportBody"/>
       </w:pPr>
       <w:r>
-        <w:t>Для внутренних синхронных путей ограничение 20 нс соблюдено: худший запас времени установки составляет +5,270 нс, суммарное нарушение равно нулю. Худший запас времени удержания составляет +0,189 нс. Наиболее длинный путь идёт от регистра индекса контрольного вектора к регистру решения классификатора; его задержка данных составляет 14,675 нс, в том числе 9,371 нс приходится на соединения. Оценка относится к данной реализации и заданному периоду, а не к произвольной отладочной плате.</w:t>
-      </w:r>
-    </w:p>
-    <w:p>
-      <w:pPr>
-        <w:pStyle w:val="ReportHeading2"/>
-      </w:pPr>
-      <w:r>
-        <w:t>10.3 Границы проверки</w:t>
+        <w:t>Для прототипа не заданы внешние задержки у 2 входов и 18 выходов. Отчёт DRC содержит CFGBVS-1, NSTD-1, UCIO-1. Плата не выбрана, поэтому не задавались физические выводы, стандарты ввода-вывода и напряжение конфигурации. Битовый поток не создавался и испытание на плате не проводилось. Подтверждены симуляция, синтез и физическая реализация для указанного кристалла.</w:t>
       </w:r>
     </w:p>
     <w:p>
@@ -6501,7 +6533,7 @@
         <w:pStyle w:val="ReportBody"/>
       </w:pPr>
       <w:r>
-        <w:t>У 2 входов и 18 выходов не заданы внешние задержки; приведённый вывод о выполнении таймингов относится к внутренним синхронным путям. В отчёте DRC отмечены 3 нарушения: NSTD-1, UCIO-1 и CFGBVS-1. Причина — отсутствие выбранной отладочной платы и сведений о её распиновке, стандартах ввода-вывода и напряжении конфигурации. Поэтому битовый поток не генерировался и проверка на плате не проводилась. Подтверждены симуляция и физическая реализация в Vivado для выбранного кристалла.</w:t>
+        <w:t>В отдельном монолитном классификаторе Vivado предупредил об удалении одного промежуточного бита при оптимизации. Для сравнения вариантов использованы модульные вычислительные тракты; их ответы проверены на 2331 входе также после синтеза. Все четыре файла параметров сети успешно прочитаны при синтезе.</w:t>
       </w:r>
     </w:p>
     <w:p>
@@ -6521,7 +6553,7 @@
       </w:pPr>
       <w:r>
         <w:rPr/>
-        <w:t>В практических работах № 1–3 построена программная модель бинарного классификатора падений 5→8→1, разработана её целочисленная RTL-реализация и создан прототип для ПЛИС. Программная модель дала на тестовой выборке 97,0 % accuracy, 84,5 % precision и 93,6 % recall. RTL-классификатор совпал с целочисленным эталоном на 2331 проверенном векторе. Самопроверяющийся прототип успешно прошёл три сценария XSim с набором из 64 векторов. В Vivado 2022.2 для Artix-7 xc7a100tcsg324-1 выполнены размещение и трассировка: проложены все 760 трассируемых цепей, ошибок маршрутизации нет, WNS при периоде 20 нс равен +5,270 нс. Результат подтверждает реализуемость вычислительного тракта на выбранном кристалле. Назначение выводов, генерация битового потока и испытание на плате не выполнялись.</w:t>
+        <w:t>Построены программная модель, целочисленный RTL-классификатор и прототип на Artix-7. На 2331 эталонном векторе подтверждено совпадение вычислений с эталоном в поведенческой симуляции; для модульных вариантов — также после синтеза. Верхний модуль проверил 64 контрольных входа, обнаружение ошибки и повторный запуск. Размещение и трассировка в Vivado 2022.2 завершены для исходного и конвейерного вариантов. При периоде 20 нс запас по установке вырос с 6,940 до 9,667 нс (на 2,727 нс). При периоде 10 нс оба варианта выдержали ограничение: WNS составил 0,055 и 1,016 нс соответственно. Оценка относится к внутренним синхронным путям; назначение выводов и проверка на плате не выполнялись.</w:t>
       </w:r>
     </w:p>
     <w:p>
@@ -6625,7 +6657,7 @@
         <w:pStyle w:val="ReportSource"/>
       </w:pPr>
       <w:r>
-        <w:t>10. AMD. Vivado Design Suite User Guide: Implementation (UG904), version 2022.2. — URL: https://docs.amd.com/r/2022.2-English/ug904-vivado-implementation/ (дата обращения: 03.10.2026).</w:t>
+        <w:t>10. AMD. Vivado Design Suite User Guide: Implementation (UG904), version 2022.2. — URL: https://docs.amd.com/r/2022.2-English/ug904-vivado-implementation/ (дата обращения: 28.10.2026).</w:t>
       </w:r>
     </w:p>
     <w:p>
@@ -9284,7 +9316,7 @@
         <w:br/>
         <w:t xml:space="preserve">    reg [31:0] b_a [0:7];</w:t>
         <w:br/>
-        <w:t xml:space="preserve">    reg        w_b [0:7];</w:t>
+        <w:t xml:space="preserve">    reg [0:0]  w_b [0:7];</w:t>
         <w:br/>
         <w:t xml:space="preserve">    reg [31:0] b_b [0:0];</w:t>
         <w:br/>
@@ -9355,7 +9387,7 @@
         <w:br/>
         <w:t xml:space="preserve">        for (h = 0; h &lt; 8; h = h + 1)</w:t>
         <w:br/>
-        <w:t xml:space="preserve">            matching_bits = matching_bits + (hidden_bits[h] ~^ w_b[h]);</w:t>
+        <w:t xml:space="preserve">            matching_bits = matching_bits + (hidden_bits[h] ~^ w_b[h][0]);</w:t>
         <w:br/>
         <w:br/>
         <w:t xml:space="preserve">        score = ($signed({28'b0, matching_bits}) &lt;&lt;&lt; 1)</w:t>
@@ -9641,7 +9673,7 @@
         <w:pStyle w:val="ReportAppendixTitle"/>
       </w:pPr>
       <w:r>
-        <w:t>Код прототипа и ограничение тактового сигнала</w:t>
+        <w:t>Код прототипа и конвейерного варианта</w:t>
       </w:r>
     </w:p>
     <w:p>
@@ -9649,7 +9681,7 @@
         <w:pStyle w:val="ReportBody"/>
       </w:pPr>
       <w:r>
-        <w:t>Приведены полные тексты верхнего модуля, его тестбенча и временного ограничения. Комментарии опущены.</w:t>
+        <w:t>Приведены полные тексты вычислительных и верхних модулей, использованных для реализации и сравнения. Комментарии опущены.</w:t>
       </w:r>
     </w:p>
     <w:p>
@@ -9657,7 +9689,7 @@
         <w:pStyle w:val="ReportListingCaption"/>
       </w:pPr>
       <w:r>
-        <w:t>Листинг В.1 — Верхний модуль прототипа</w:t>
+        <w:t>Листинг В.1 — Слой A</w:t>
       </w:r>
     </w:p>
     <w:p>
@@ -9671,164 +9703,66 @@
         <w:t>`timescale 1ns / 1ps</w:t>
         <w:br/>
         <w:br/>
-        <w:t>module fpga_top (</w:t>
-        <w:br/>
-        <w:t xml:space="preserve">    input  wire       clk,</w:t>
-        <w:br/>
-        <w:t xml:space="preserve">    input  wire       rst_n,</w:t>
-        <w:br/>
-        <w:t xml:space="preserve">    input  wire       start,</w:t>
-        <w:br/>
-        <w:t xml:space="preserve">    output reg        busy,</w:t>
-        <w:br/>
-        <w:t xml:space="preserve">    output reg        done,</w:t>
-        <w:br/>
-        <w:t xml:space="preserve">    output reg        pass,</w:t>
-        <w:br/>
-        <w:t xml:space="preserve">    output reg [6:0]  checked_count,</w:t>
-        <w:br/>
-        <w:t xml:space="preserve">    output reg [6:0]  error_count,</w:t>
-        <w:br/>
-        <w:t xml:space="preserve">    output reg        last_prediction</w:t>
+        <w:t>module bnn_layer_a #(</w:t>
+        <w:br/>
+        <w:t xml:space="preserve">    parameter W_FILE = "weights_layerA_W.mem",</w:t>
+        <w:br/>
+        <w:t xml:space="preserve">    parameter B_FILE = "weights_layerA_b.mem"</w:t>
+        <w:br/>
+        <w:t>) (</w:t>
+        <w:br/>
+        <w:t xml:space="preserve">    input  wire [39:0] input_features,</w:t>
+        <w:br/>
+        <w:t xml:space="preserve">    output reg  [7:0]  hidden_bits</w:t>
         <w:br/>
         <w:t>);</w:t>
         <w:br/>
-        <w:t xml:space="preserve">    localparam [1:0] IDLE = 2'd0;</w:t>
-        <w:br/>
-        <w:t xml:space="preserve">    localparam [1:0] DRIVE = 2'd1;</w:t>
-        <w:br/>
-        <w:t xml:space="preserve">    localparam [1:0] CHECK = 2'd2;</w:t>
-        <w:br/>
-        <w:br/>
-        <w:t xml:space="preserve">    reg [1:0] state;</w:t>
-        <w:br/>
-        <w:t xml:space="preserve">    reg [5:0] vector_index;</w:t>
-        <w:br/>
-        <w:t xml:space="preserve">    reg [39:0] vectors [0:63];</w:t>
-        <w:br/>
-        <w:t xml:space="preserve">    reg expected [0:63];</w:t>
+        <w:t xml:space="preserve">    reg [7:0]  weights [0:39];</w:t>
+        <w:br/>
+        <w:t xml:space="preserve">    reg [31:0] biases [0:7];</w:t>
         <w:br/>
         <w:br/>
         <w:t xml:space="preserve">    initial begin</w:t>
         <w:br/>
-        <w:t xml:space="preserve">        $readmemh("tb_inputs_64.mem", vectors);</w:t>
-        <w:br/>
-        <w:t xml:space="preserve">        $readmemh("tb_expected_64.mem", expected);</w:t>
+        <w:t xml:space="preserve">        $readmemh(W_FILE, weights);</w:t>
+        <w:br/>
+        <w:t xml:space="preserve">        $readmemh(B_FILE, biases);</w:t>
         <w:br/>
         <w:t xml:space="preserve">    end</w:t>
         <w:br/>
         <w:br/>
-        <w:t xml:space="preserve">    wire [39:0] input_features = vectors[vector_index];</w:t>
-        <w:br/>
-        <w:t xml:space="preserve">    wire valid_in = (state == DRIVE);</w:t>
-        <w:br/>
-        <w:t xml:space="preserve">    wire valid_out;</w:t>
-        <w:br/>
-        <w:t xml:space="preserve">    wire fall_detected;</w:t>
-        <w:br/>
-        <w:t xml:space="preserve">    wire mismatch = (valid_out != 1'b1) ||</w:t>
-        <w:br/>
-        <w:t xml:space="preserve">                    (fall_detected != expected[vector_index]);</w:t>
-        <w:br/>
-        <w:br/>
-        <w:t xml:space="preserve">    bnn_classifier classifier (</w:t>
-        <w:br/>
-        <w:t xml:space="preserve">        .clk(clk),</w:t>
-        <w:br/>
-        <w:t xml:space="preserve">        .rst_n(rst_n),</w:t>
-        <w:br/>
-        <w:t xml:space="preserve">        .valid_in(valid_in),</w:t>
-        <w:br/>
-        <w:t xml:space="preserve">        .input_features(input_features),</w:t>
-        <w:br/>
-        <w:t xml:space="preserve">        .valid_out(valid_out),</w:t>
-        <w:br/>
-        <w:t xml:space="preserve">        .fall_detected(fall_detected)</w:t>
-        <w:br/>
-        <w:t xml:space="preserve">    );</w:t>
-        <w:br/>
-        <w:br/>
-        <w:t xml:space="preserve">    always @(posedge clk) begin</w:t>
-        <w:br/>
-        <w:t xml:space="preserve">        if (!rst_n) begin</w:t>
-        <w:br/>
-        <w:t xml:space="preserve">            state &lt;= IDLE;</w:t>
-        <w:br/>
-        <w:t xml:space="preserve">            vector_index &lt;= 6'd0;</w:t>
-        <w:br/>
-        <w:t xml:space="preserve">            busy &lt;= 1'b0;</w:t>
-        <w:br/>
-        <w:t xml:space="preserve">            done &lt;= 1'b0;</w:t>
-        <w:br/>
-        <w:t xml:space="preserve">            pass &lt;= 1'b0;</w:t>
-        <w:br/>
-        <w:t xml:space="preserve">            checked_count &lt;= 7'd0;</w:t>
-        <w:br/>
-        <w:t xml:space="preserve">            error_count &lt;= 7'd0;</w:t>
-        <w:br/>
-        <w:t xml:space="preserve">            last_prediction &lt;= 1'b0;</w:t>
-        <w:br/>
-        <w:t xml:space="preserve">        end else begin</w:t>
-        <w:br/>
-        <w:t xml:space="preserve">            case (state)</w:t>
-        <w:br/>
-        <w:t xml:space="preserve">                IDLE: begin</w:t>
-        <w:br/>
-        <w:t xml:space="preserve">                    if (start) begin</w:t>
-        <w:br/>
-        <w:t xml:space="preserve">                        vector_index &lt;= 6'd0;</w:t>
-        <w:br/>
-        <w:t xml:space="preserve">                        busy &lt;= 1'b1;</w:t>
-        <w:br/>
-        <w:t xml:space="preserve">                        done &lt;= 1'b0;</w:t>
-        <w:br/>
-        <w:t xml:space="preserve">                        pass &lt;= 1'b0;</w:t>
-        <w:br/>
-        <w:t xml:space="preserve">                        checked_count &lt;= 7'd0;</w:t>
-        <w:br/>
-        <w:t xml:space="preserve">                        error_count &lt;= 7'd0;</w:t>
-        <w:br/>
-        <w:t xml:space="preserve">                        state &lt;= DRIVE;</w:t>
-        <w:br/>
-        <w:t xml:space="preserve">                    end</w:t>
-        <w:br/>
-        <w:t xml:space="preserve">                end</w:t>
-        <w:br/>
-        <w:t xml:space="preserve">                DRIVE: state &lt;= CHECK;</w:t>
-        <w:br/>
-        <w:t xml:space="preserve">                CHECK: begin</w:t>
-        <w:br/>
-        <w:t xml:space="preserve">                    checked_count &lt;= checked_count + 7'd1;</w:t>
-        <w:br/>
-        <w:t xml:space="preserve">                    last_prediction &lt;= fall_detected;</w:t>
-        <w:br/>
-        <w:t xml:space="preserve">                    if (mismatch)</w:t>
-        <w:br/>
-        <w:t xml:space="preserve">                        error_count &lt;= error_count + 7'd1;</w:t>
-        <w:br/>
-        <w:t xml:space="preserve">                    if (vector_index == 6'd63) begin</w:t>
-        <w:br/>
-        <w:t xml:space="preserve">                        busy &lt;= 1'b0;</w:t>
-        <w:br/>
-        <w:t xml:space="preserve">                        done &lt;= 1'b1;</w:t>
-        <w:br/>
-        <w:t xml:space="preserve">                        pass &lt;= (error_count == 7'd0) &amp;&amp; !mismatch;</w:t>
-        <w:br/>
-        <w:t xml:space="preserve">                        state &lt;= IDLE;</w:t>
-        <w:br/>
-        <w:t xml:space="preserve">                    end else begin</w:t>
-        <w:br/>
-        <w:t xml:space="preserve">                        vector_index &lt;= vector_index + 6'd1;</w:t>
-        <w:br/>
-        <w:t xml:space="preserve">                        state &lt;= DRIVE;</w:t>
-        <w:br/>
-        <w:t xml:space="preserve">                    end</w:t>
-        <w:br/>
-        <w:t xml:space="preserve">                end</w:t>
-        <w:br/>
-        <w:t xml:space="preserve">                default: state &lt;= IDLE;</w:t>
-        <w:br/>
-        <w:t xml:space="preserve">            endcase</w:t>
+        <w:t xml:space="preserve">    reg signed [15:0] product;</w:t>
+        <w:br/>
+        <w:t xml:space="preserve">    reg signed [31:0] accumulator;</w:t>
+        <w:br/>
+        <w:t xml:space="preserve">    integer h;</w:t>
+        <w:br/>
+        <w:t xml:space="preserve">    integer j;</w:t>
+        <w:br/>
+        <w:br/>
+        <w:t xml:space="preserve">    always @* begin</w:t>
+        <w:br/>
+        <w:t xml:space="preserve">        product = 16'sd0;</w:t>
+        <w:br/>
+        <w:t xml:space="preserve">        accumulator = 32'sd0;</w:t>
+        <w:br/>
+        <w:t xml:space="preserve">        hidden_bits = 8'b0;</w:t>
+        <w:br/>
+        <w:t xml:space="preserve">        for (h = 0; h &lt; 8; h = h + 1) begin</w:t>
+        <w:br/>
+        <w:t xml:space="preserve">            accumulator = $signed(biases[h]);</w:t>
+        <w:br/>
+        <w:t xml:space="preserve">            for (j = 0; j &lt; 5; j = j + 1) begin</w:t>
+        <w:br/>
+        <w:t xml:space="preserve">                product = $signed(input_features[39 - 8*j -: 8])</w:t>
+        <w:br/>
+        <w:t xml:space="preserve">                        * $signed(weights[j*8 + h]);</w:t>
+        <w:br/>
+        <w:t xml:space="preserve">                accumulator = accumulator + {{16{product[15]}}, product};</w:t>
+        <w:br/>
+        <w:t xml:space="preserve">            end</w:t>
+        <w:br/>
+        <w:t xml:space="preserve">            hidden_bits[h] = (accumulator &gt;= 32'sd0);</w:t>
         <w:br/>
         <w:t xml:space="preserve">        end</w:t>
         <w:br/>
@@ -9842,7 +9776,7 @@
         <w:pStyle w:val="ReportListingCaption"/>
       </w:pPr>
       <w:r>
-        <w:t>Листинг В.2 — Тестбенч прототипа</w:t>
+        <w:t>Листинг В.2 — Слой B</w:t>
       </w:r>
     </w:p>
     <w:p>
@@ -9856,131 +9790,57 @@
         <w:t>`timescale 1ns / 1ps</w:t>
         <w:br/>
         <w:br/>
-        <w:t>module tb_fpga_top;</w:t>
-        <w:br/>
-        <w:t xml:space="preserve">    reg clk = 1'b0;</w:t>
-        <w:br/>
-        <w:t xml:space="preserve">    always #5 clk = ~clk;</w:t>
-        <w:br/>
-        <w:br/>
-        <w:t xml:space="preserve">    reg rst_n = 1'b0;</w:t>
-        <w:br/>
-        <w:t xml:space="preserve">    reg start = 1'b0;</w:t>
-        <w:br/>
-        <w:t xml:space="preserve">    wire busy;</w:t>
-        <w:br/>
-        <w:t xml:space="preserve">    wire done;</w:t>
-        <w:br/>
-        <w:t xml:space="preserve">    wire pass;</w:t>
-        <w:br/>
-        <w:t xml:space="preserve">    wire [6:0] checked_count;</w:t>
-        <w:br/>
-        <w:t xml:space="preserve">    wire [6:0] error_count;</w:t>
-        <w:br/>
-        <w:t xml:space="preserve">    wire last_prediction;</w:t>
-        <w:br/>
-        <w:t xml:space="preserve">    reg saved_expected;</w:t>
-        <w:br/>
-        <w:t xml:space="preserve">    integer cycles;</w:t>
-        <w:br/>
-        <w:br/>
-        <w:t xml:space="preserve">    fpga_top dut (</w:t>
-        <w:br/>
-        <w:t xml:space="preserve">        .clk(clk),</w:t>
-        <w:br/>
-        <w:t xml:space="preserve">        .rst_n(rst_n),</w:t>
-        <w:br/>
-        <w:t xml:space="preserve">        .start(start),</w:t>
-        <w:br/>
-        <w:t xml:space="preserve">        .busy(busy),</w:t>
-        <w:br/>
-        <w:t xml:space="preserve">        .done(done),</w:t>
-        <w:br/>
-        <w:t xml:space="preserve">        .pass(pass),</w:t>
-        <w:br/>
-        <w:t xml:space="preserve">        .checked_count(checked_count),</w:t>
-        <w:br/>
-        <w:t xml:space="preserve">        .error_count(error_count),</w:t>
-        <w:br/>
-        <w:t xml:space="preserve">        .last_prediction(last_prediction)</w:t>
-        <w:br/>
-        <w:t xml:space="preserve">    );</w:t>
-        <w:br/>
-        <w:br/>
-        <w:t xml:space="preserve">    task run_once;</w:t>
-        <w:br/>
-        <w:t xml:space="preserve">        input [6:0] wanted_errors;</w:t>
-        <w:br/>
-        <w:t xml:space="preserve">        begin</w:t>
-        <w:br/>
-        <w:t xml:space="preserve">            @(negedge clk);</w:t>
-        <w:br/>
-        <w:t xml:space="preserve">            start = 1'b1;</w:t>
-        <w:br/>
-        <w:t xml:space="preserve">            @(negedge clk);</w:t>
-        <w:br/>
-        <w:t xml:space="preserve">            start = 1'b0;</w:t>
-        <w:br/>
-        <w:t xml:space="preserve">            if (busy !== 1'b1 || done !== 1'b0)</w:t>
-        <w:br/>
-        <w:t xml:space="preserve">                $fatal(1, "start did not begin a new run");</w:t>
-        <w:br/>
-        <w:br/>
-        <w:t xml:space="preserve">            cycles = 0;</w:t>
-        <w:br/>
-        <w:t xml:space="preserve">            while (done !== 1'b1 &amp;&amp; cycles &lt; 140) begin</w:t>
-        <w:br/>
-        <w:t xml:space="preserve">                @(posedge clk);</w:t>
-        <w:br/>
-        <w:t xml:space="preserve">                cycles = cycles + 1;</w:t>
-        <w:br/>
-        <w:t xml:space="preserve">            end</w:t>
-        <w:br/>
-        <w:t xml:space="preserve">            if (done !== 1'b1)</w:t>
-        <w:br/>
-        <w:t xml:space="preserve">                $fatal(1, "prototype did not finish");</w:t>
-        <w:br/>
-        <w:t xml:space="preserve">            if (busy !== 1'b0 || checked_count !== 7'd64 ||</w:t>
-        <w:br/>
-        <w:t xml:space="preserve">                error_count !== wanted_errors ||</w:t>
-        <w:br/>
-        <w:t xml:space="preserve">                pass !== (wanted_errors == 7'd0))</w:t>
-        <w:br/>
-        <w:t xml:space="preserve">                $fatal(1, "wrong result: checked=%0d errors=%0d pass=%b",</w:t>
-        <w:br/>
-        <w:t xml:space="preserve">                       checked_count, error_count, pass);</w:t>
-        <w:br/>
-        <w:t xml:space="preserve">        end</w:t>
-        <w:br/>
-        <w:t xml:space="preserve">    endtask</w:t>
+        <w:t>module bnn_layer_b #(</w:t>
+        <w:br/>
+        <w:t xml:space="preserve">    parameter W_FILE = "weights_layerB_W.mem",</w:t>
+        <w:br/>
+        <w:t xml:space="preserve">    parameter B_FILE = "weights_layerB_b.mem"</w:t>
+        <w:br/>
+        <w:t>) (</w:t>
+        <w:br/>
+        <w:t xml:space="preserve">    input  wire [7:0]         hidden_bits,</w:t>
+        <w:br/>
+        <w:t xml:space="preserve">    output reg  signed [31:0] score,</w:t>
+        <w:br/>
+        <w:t xml:space="preserve">    output reg                prediction</w:t>
+        <w:br/>
+        <w:t>);</w:t>
+        <w:br/>
+        <w:t xml:space="preserve">    reg [0:0]  weights [0:7];</w:t>
+        <w:br/>
+        <w:t xml:space="preserve">    reg [31:0] biases [0:0];</w:t>
         <w:br/>
         <w:br/>
         <w:t xml:space="preserve">    initial begin</w:t>
         <w:br/>
-        <w:t xml:space="preserve">        repeat (2) @(negedge clk);</w:t>
-        <w:br/>
-        <w:t xml:space="preserve">        rst_n = 1'b1;</w:t>
-        <w:br/>
-        <w:t xml:space="preserve">        run_once(7'd0);</w:t>
-        <w:br/>
-        <w:br/>
-        <w:t xml:space="preserve">        saved_expected = dut.expected[3];</w:t>
-        <w:br/>
-        <w:t xml:space="preserve">        dut.expected[3] = ~saved_expected;</w:t>
-        <w:br/>
-        <w:t xml:space="preserve">        run_once(7'd1);</w:t>
-        <w:br/>
-        <w:t xml:space="preserve">        dut.expected[3] = saved_expected;</w:t>
-        <w:br/>
-        <w:t xml:space="preserve">        run_once(7'd0);</w:t>
-        <w:br/>
-        <w:br/>
-        <w:t xml:space="preserve">        $display("PASS: FPGA prototype self-test; 64 vectors, error detection and restart");</w:t>
-        <w:br/>
-        <w:t xml:space="preserve">        $finish;</w:t>
+        <w:t xml:space="preserve">        $readmemh(W_FILE, weights);</w:t>
+        <w:br/>
+        <w:t xml:space="preserve">        $readmemh(B_FILE, biases);</w:t>
         <w:br/>
         <w:t xml:space="preserve">    end</w:t>
         <w:br/>
+        <w:br/>
+        <w:t xml:space="preserve">    reg [3:0] matching_bits;</w:t>
+        <w:br/>
+        <w:t xml:space="preserve">    integer h;</w:t>
+        <w:br/>
+        <w:br/>
+        <w:t xml:space="preserve">    always @* begin</w:t>
+        <w:br/>
+        <w:t xml:space="preserve">        matching_bits = 4'b0;</w:t>
+        <w:br/>
+        <w:t xml:space="preserve">        for (h = 0; h &lt; 8; h = h + 1)</w:t>
+        <w:br/>
+        <w:t xml:space="preserve">            matching_bits = matching_bits + (hidden_bits[h] ~^ weights[h][0]);</w:t>
+        <w:br/>
+        <w:t xml:space="preserve">        score = ($signed({28'b0, matching_bits}) &lt;&lt;&lt; 1)</w:t>
+        <w:br/>
+        <w:t xml:space="preserve">              - 32'sd8 + $signed(biases[0]);</w:t>
+        <w:br/>
+        <w:t xml:space="preserve">        prediction = (score &gt;= 32'sd0);</w:t>
+        <w:br/>
+        <w:t xml:space="preserve">    end</w:t>
+        <w:br/>
         <w:t>endmodule</w:t>
       </w:r>
     </w:p>
@@ -9989,7 +9849,7 @@
         <w:pStyle w:val="ReportListingCaption"/>
       </w:pPr>
       <w:r>
-        <w:t>Листинг В.3 — Ограничение тактового сигнала</w:t>
+        <w:t>Листинг В.3 — Классификатор без промежуточного регистра</w:t>
       </w:r>
     </w:p>
     <w:p>
@@ -10000,7 +9860,718 @@
         <w:rPr>
           <w:sz w:val="18"/>
         </w:rPr>
-        <w:t>create_clock -name clk -period 20.000 [get_ports clk]</w:t>
+        <w:t>`timescale 1ns / 1ps</w:t>
+        <w:br/>
+        <w:br/>
+        <w:t>module bnn_classifier_modular #(</w:t>
+        <w:br/>
+        <w:t xml:space="preserve">    parameter W_A_FILE = "weights_layerA_W.mem",</w:t>
+        <w:br/>
+        <w:t xml:space="preserve">    parameter B_A_FILE = "weights_layerA_b.mem",</w:t>
+        <w:br/>
+        <w:t xml:space="preserve">    parameter W_B_FILE = "weights_layerB_W.mem",</w:t>
+        <w:br/>
+        <w:t xml:space="preserve">    parameter B_B_FILE = "weights_layerB_b.mem"</w:t>
+        <w:br/>
+        <w:t>) (</w:t>
+        <w:br/>
+        <w:t xml:space="preserve">    input  wire        clk,</w:t>
+        <w:br/>
+        <w:t xml:space="preserve">    input  wire        rst_n,</w:t>
+        <w:br/>
+        <w:t xml:space="preserve">    input  wire        valid_in,</w:t>
+        <w:br/>
+        <w:t xml:space="preserve">    input  wire [39:0] input_features,</w:t>
+        <w:br/>
+        <w:t xml:space="preserve">    output reg         valid_out,</w:t>
+        <w:br/>
+        <w:t xml:space="preserve">    output reg         fall_detected</w:t>
+        <w:br/>
+        <w:t>);</w:t>
+        <w:br/>
+        <w:t xml:space="preserve">    wire [7:0] hidden_bits;</w:t>
+        <w:br/>
+        <w:t xml:space="preserve">    wire signed [31:0] score;</w:t>
+        <w:br/>
+        <w:t xml:space="preserve">    wire prediction_next;</w:t>
+        <w:br/>
+        <w:br/>
+        <w:t xml:space="preserve">    bnn_layer_a #(.W_FILE(W_A_FILE), .B_FILE(B_A_FILE)) layer_a (</w:t>
+        <w:br/>
+        <w:t xml:space="preserve">        .input_features(input_features),</w:t>
+        <w:br/>
+        <w:t xml:space="preserve">        .hidden_bits(hidden_bits)</w:t>
+        <w:br/>
+        <w:t xml:space="preserve">    );</w:t>
+        <w:br/>
+        <w:br/>
+        <w:t xml:space="preserve">    bnn_layer_b #(.W_FILE(W_B_FILE), .B_FILE(B_B_FILE)) layer_b (</w:t>
+        <w:br/>
+        <w:t xml:space="preserve">        .hidden_bits(hidden_bits),</w:t>
+        <w:br/>
+        <w:t xml:space="preserve">        .score(score),</w:t>
+        <w:br/>
+        <w:t xml:space="preserve">        .prediction(prediction_next)</w:t>
+        <w:br/>
+        <w:t xml:space="preserve">    );</w:t>
+        <w:br/>
+        <w:br/>
+        <w:t xml:space="preserve">    always @(posedge clk) begin</w:t>
+        <w:br/>
+        <w:t xml:space="preserve">        if (!rst_n) begin</w:t>
+        <w:br/>
+        <w:t xml:space="preserve">            valid_out &lt;= 1'b0;</w:t>
+        <w:br/>
+        <w:t xml:space="preserve">            fall_detected &lt;= 1'b0;</w:t>
+        <w:br/>
+        <w:t xml:space="preserve">        end else begin</w:t>
+        <w:br/>
+        <w:t xml:space="preserve">            valid_out &lt;= valid_in;</w:t>
+        <w:br/>
+        <w:t xml:space="preserve">            if (valid_in)</w:t>
+        <w:br/>
+        <w:t xml:space="preserve">                fall_detected &lt;= prediction_next;</w:t>
+        <w:br/>
+        <w:t xml:space="preserve">        end</w:t>
+        <w:br/>
+        <w:t xml:space="preserve">    end</w:t>
+        <w:br/>
+        <w:t>endmodule</w:t>
+      </w:r>
+    </w:p>
+    <w:p>
+      <w:pPr>
+        <w:pStyle w:val="ReportListingCaption"/>
+      </w:pPr>
+      <w:r>
+        <w:t>Листинг В.4 — Конвейерный классификатор</w:t>
+      </w:r>
+    </w:p>
+    <w:p>
+      <w:pPr>
+        <w:pStyle w:val="ReportCode"/>
+      </w:pPr>
+      <w:r>
+        <w:rPr>
+          <w:sz w:val="18"/>
+        </w:rPr>
+        <w:t>`timescale 1ns / 1ps</w:t>
+        <w:br/>
+        <w:br/>
+        <w:t>module bnn_classifier_pipelined #(</w:t>
+        <w:br/>
+        <w:t xml:space="preserve">    parameter W_A_FILE = "weights_layerA_W.mem",</w:t>
+        <w:br/>
+        <w:t xml:space="preserve">    parameter B_A_FILE = "weights_layerA_b.mem",</w:t>
+        <w:br/>
+        <w:t xml:space="preserve">    parameter W_B_FILE = "weights_layerB_W.mem",</w:t>
+        <w:br/>
+        <w:t xml:space="preserve">    parameter B_B_FILE = "weights_layerB_b.mem"</w:t>
+        <w:br/>
+        <w:t>) (</w:t>
+        <w:br/>
+        <w:t xml:space="preserve">    input  wire        clk,</w:t>
+        <w:br/>
+        <w:t xml:space="preserve">    input  wire        rst_n,</w:t>
+        <w:br/>
+        <w:t xml:space="preserve">    input  wire        valid_in,</w:t>
+        <w:br/>
+        <w:t xml:space="preserve">    input  wire [39:0] input_features,</w:t>
+        <w:br/>
+        <w:t xml:space="preserve">    output reg         valid_out,</w:t>
+        <w:br/>
+        <w:t xml:space="preserve">    output reg         fall_detected</w:t>
+        <w:br/>
+        <w:t>);</w:t>
+        <w:br/>
+        <w:t xml:space="preserve">    wire [7:0] hidden_next;</w:t>
+        <w:br/>
+        <w:t xml:space="preserve">    reg [7:0] hidden_q;</w:t>
+        <w:br/>
+        <w:t xml:space="preserve">    reg valid_hidden_q;</w:t>
+        <w:br/>
+        <w:t xml:space="preserve">    wire signed [31:0] score;</w:t>
+        <w:br/>
+        <w:t xml:space="preserve">    wire prediction_next;</w:t>
+        <w:br/>
+        <w:br/>
+        <w:t xml:space="preserve">    bnn_layer_a #(.W_FILE(W_A_FILE), .B_FILE(B_A_FILE)) layer_a (</w:t>
+        <w:br/>
+        <w:t xml:space="preserve">        .input_features(input_features),</w:t>
+        <w:br/>
+        <w:t xml:space="preserve">        .hidden_bits(hidden_next)</w:t>
+        <w:br/>
+        <w:t xml:space="preserve">    );</w:t>
+        <w:br/>
+        <w:br/>
+        <w:t xml:space="preserve">    bnn_layer_b #(.W_FILE(W_B_FILE), .B_FILE(B_B_FILE)) layer_b (</w:t>
+        <w:br/>
+        <w:t xml:space="preserve">        .hidden_bits(hidden_q),</w:t>
+        <w:br/>
+        <w:t xml:space="preserve">        .score(score),</w:t>
+        <w:br/>
+        <w:t xml:space="preserve">        .prediction(prediction_next)</w:t>
+        <w:br/>
+        <w:t xml:space="preserve">    );</w:t>
+        <w:br/>
+        <w:br/>
+        <w:t xml:space="preserve">    always @(posedge clk) begin</w:t>
+        <w:br/>
+        <w:t xml:space="preserve">        if (!rst_n) begin</w:t>
+        <w:br/>
+        <w:t xml:space="preserve">            hidden_q &lt;= 8'b0;</w:t>
+        <w:br/>
+        <w:t xml:space="preserve">            valid_hidden_q &lt;= 1'b0;</w:t>
+        <w:br/>
+        <w:t xml:space="preserve">            valid_out &lt;= 1'b0;</w:t>
+        <w:br/>
+        <w:t xml:space="preserve">            fall_detected &lt;= 1'b0;</w:t>
+        <w:br/>
+        <w:t xml:space="preserve">        end else begin</w:t>
+        <w:br/>
+        <w:t xml:space="preserve">            hidden_q &lt;= hidden_next;</w:t>
+        <w:br/>
+        <w:t xml:space="preserve">            valid_hidden_q &lt;= valid_in;</w:t>
+        <w:br/>
+        <w:t xml:space="preserve">            valid_out &lt;= valid_hidden_q;</w:t>
+        <w:br/>
+        <w:t xml:space="preserve">            if (valid_hidden_q)</w:t>
+        <w:br/>
+        <w:t xml:space="preserve">                fall_detected &lt;= prediction_next;</w:t>
+        <w:br/>
+        <w:t xml:space="preserve">        end</w:t>
+        <w:br/>
+        <w:t xml:space="preserve">    end</w:t>
+        <w:br/>
+        <w:t>endmodule</w:t>
+      </w:r>
+    </w:p>
+    <w:p>
+      <w:pPr>
+        <w:pStyle w:val="ReportListingCaption"/>
+      </w:pPr>
+      <w:r>
+        <w:t>Листинг В.5 — Прототип с контрольными данными</w:t>
+      </w:r>
+    </w:p>
+    <w:p>
+      <w:pPr>
+        <w:pStyle w:val="ReportCode"/>
+      </w:pPr>
+      <w:r>
+        <w:rPr>
+          <w:sz w:val="18"/>
+        </w:rPr>
+        <w:t>`timescale 1ns / 1ps</w:t>
+        <w:br/>
+        <w:br/>
+        <w:t>module fpga_top (</w:t>
+        <w:br/>
+        <w:t xml:space="preserve">    input  wire       clk,</w:t>
+        <w:br/>
+        <w:t xml:space="preserve">    input  wire       rst_n,</w:t>
+        <w:br/>
+        <w:t xml:space="preserve">    input  wire       start,</w:t>
+        <w:br/>
+        <w:t xml:space="preserve">    output reg        busy,</w:t>
+        <w:br/>
+        <w:t xml:space="preserve">    output reg        done,</w:t>
+        <w:br/>
+        <w:t xml:space="preserve">    output reg        pass,</w:t>
+        <w:br/>
+        <w:t xml:space="preserve">    output reg [6:0]  checked_count,</w:t>
+        <w:br/>
+        <w:t xml:space="preserve">    output reg [6:0]  error_count,</w:t>
+        <w:br/>
+        <w:t xml:space="preserve">    output reg        last_prediction</w:t>
+        <w:br/>
+        <w:t>);</w:t>
+        <w:br/>
+        <w:t xml:space="preserve">    localparam [1:0] IDLE = 2'd0;</w:t>
+        <w:br/>
+        <w:t xml:space="preserve">    localparam [1:0] DRIVE = 2'd1;</w:t>
+        <w:br/>
+        <w:t xml:space="preserve">    localparam [1:0] CHECK = 2'd2;</w:t>
+        <w:br/>
+        <w:br/>
+        <w:t xml:space="preserve">    reg [1:0] state;</w:t>
+        <w:br/>
+        <w:t xml:space="preserve">    reg [5:0] vector_index;</w:t>
+        <w:br/>
+        <w:t xml:space="preserve">    reg [39:0] vectors [0:63];</w:t>
+        <w:br/>
+        <w:t xml:space="preserve">    reg [0:0] expected [0:63];</w:t>
+        <w:br/>
+        <w:br/>
+        <w:t xml:space="preserve">    initial begin</w:t>
+        <w:br/>
+        <w:t xml:space="preserve">        $readmemh("tb_inputs_64.mem", vectors);</w:t>
+        <w:br/>
+        <w:t xml:space="preserve">        $readmemh("tb_expected_64.mem", expected);</w:t>
+        <w:br/>
+        <w:t xml:space="preserve">    end</w:t>
+        <w:br/>
+        <w:br/>
+        <w:t xml:space="preserve">    wire [39:0] input_features = vectors[vector_index];</w:t>
+        <w:br/>
+        <w:t xml:space="preserve">    wire valid_in = (state == DRIVE);</w:t>
+        <w:br/>
+        <w:t xml:space="preserve">    wire valid_out;</w:t>
+        <w:br/>
+        <w:t xml:space="preserve">    wire fall_detected;</w:t>
+        <w:br/>
+        <w:t xml:space="preserve">    wire mismatch = (valid_out != 1'b1) ||</w:t>
+        <w:br/>
+        <w:t xml:space="preserve">                    (fall_detected != expected[vector_index][0]);</w:t>
+        <w:br/>
+        <w:br/>
+        <w:t xml:space="preserve">    bnn_classifier classifier (</w:t>
+        <w:br/>
+        <w:t xml:space="preserve">        .clk(clk),</w:t>
+        <w:br/>
+        <w:t xml:space="preserve">        .rst_n(rst_n),</w:t>
+        <w:br/>
+        <w:t xml:space="preserve">        .valid_in(valid_in),</w:t>
+        <w:br/>
+        <w:t xml:space="preserve">        .input_features(input_features),</w:t>
+        <w:br/>
+        <w:t xml:space="preserve">        .valid_out(valid_out),</w:t>
+        <w:br/>
+        <w:t xml:space="preserve">        .fall_detected(fall_detected)</w:t>
+        <w:br/>
+        <w:t xml:space="preserve">    );</w:t>
+        <w:br/>
+        <w:br/>
+        <w:t xml:space="preserve">    always @(posedge clk) begin</w:t>
+        <w:br/>
+        <w:t xml:space="preserve">        if (!rst_n) begin</w:t>
+        <w:br/>
+        <w:t xml:space="preserve">            state &lt;= IDLE;</w:t>
+        <w:br/>
+        <w:t xml:space="preserve">            vector_index &lt;= 6'd0;</w:t>
+        <w:br/>
+        <w:t xml:space="preserve">            busy &lt;= 1'b0;</w:t>
+        <w:br/>
+        <w:t xml:space="preserve">            done &lt;= 1'b0;</w:t>
+        <w:br/>
+        <w:t xml:space="preserve">            pass &lt;= 1'b0;</w:t>
+        <w:br/>
+        <w:t xml:space="preserve">            checked_count &lt;= 7'd0;</w:t>
+        <w:br/>
+        <w:t xml:space="preserve">            error_count &lt;= 7'd0;</w:t>
+        <w:br/>
+        <w:t xml:space="preserve">            last_prediction &lt;= 1'b0;</w:t>
+        <w:br/>
+        <w:t xml:space="preserve">        end else begin</w:t>
+        <w:br/>
+        <w:t xml:space="preserve">            case (state)</w:t>
+        <w:br/>
+        <w:t xml:space="preserve">                IDLE: begin</w:t>
+        <w:br/>
+        <w:t xml:space="preserve">                    if (start) begin</w:t>
+        <w:br/>
+        <w:t xml:space="preserve">                        vector_index &lt;= 6'd0;</w:t>
+        <w:br/>
+        <w:t xml:space="preserve">                        busy &lt;= 1'b1;</w:t>
+        <w:br/>
+        <w:t xml:space="preserve">                        done &lt;= 1'b0;</w:t>
+        <w:br/>
+        <w:t xml:space="preserve">                        pass &lt;= 1'b0;</w:t>
+        <w:br/>
+        <w:t xml:space="preserve">                        checked_count &lt;= 7'd0;</w:t>
+        <w:br/>
+        <w:t xml:space="preserve">                        error_count &lt;= 7'd0;</w:t>
+        <w:br/>
+        <w:t xml:space="preserve">                        state &lt;= DRIVE;</w:t>
+        <w:br/>
+        <w:t xml:space="preserve">                    end</w:t>
+        <w:br/>
+        <w:t xml:space="preserve">                end</w:t>
+        <w:br/>
+        <w:t xml:space="preserve">                DRIVE: state &lt;= CHECK;</w:t>
+        <w:br/>
+        <w:t xml:space="preserve">                CHECK: begin</w:t>
+        <w:br/>
+        <w:t xml:space="preserve">                    checked_count &lt;= checked_count + 7'd1;</w:t>
+        <w:br/>
+        <w:t xml:space="preserve">                    last_prediction &lt;= fall_detected;</w:t>
+        <w:br/>
+        <w:t xml:space="preserve">                    if (mismatch)</w:t>
+        <w:br/>
+        <w:t xml:space="preserve">                        error_count &lt;= error_count + 7'd1;</w:t>
+        <w:br/>
+        <w:t xml:space="preserve">                    if (vector_index == 6'd63) begin</w:t>
+        <w:br/>
+        <w:t xml:space="preserve">                        busy &lt;= 1'b0;</w:t>
+        <w:br/>
+        <w:t xml:space="preserve">                        done &lt;= 1'b1;</w:t>
+        <w:br/>
+        <w:t xml:space="preserve">                        pass &lt;= (error_count == 7'd0) &amp;&amp; !mismatch;</w:t>
+        <w:br/>
+        <w:t xml:space="preserve">                        state &lt;= IDLE;</w:t>
+        <w:br/>
+        <w:t xml:space="preserve">                    end else begin</w:t>
+        <w:br/>
+        <w:t xml:space="preserve">                        vector_index &lt;= vector_index + 6'd1;</w:t>
+        <w:br/>
+        <w:t xml:space="preserve">                        state &lt;= DRIVE;</w:t>
+        <w:br/>
+        <w:t xml:space="preserve">                    end</w:t>
+        <w:br/>
+        <w:t xml:space="preserve">                end</w:t>
+        <w:br/>
+        <w:t xml:space="preserve">                default: state &lt;= IDLE;</w:t>
+        <w:br/>
+        <w:t xml:space="preserve">            endcase</w:t>
+        <w:br/>
+        <w:t xml:space="preserve">        end</w:t>
+        <w:br/>
+        <w:t xml:space="preserve">    end</w:t>
+        <w:br/>
+        <w:t>endmodule</w:t>
+      </w:r>
+    </w:p>
+    <w:p>
+      <w:pPr>
+        <w:pStyle w:val="ReportListingCaption"/>
+      </w:pPr>
+      <w:r>
+        <w:t>Листинг В.6 — Конвейерный прототип</w:t>
+      </w:r>
+    </w:p>
+    <w:p>
+      <w:pPr>
+        <w:pStyle w:val="ReportCode"/>
+      </w:pPr>
+      <w:r>
+        <w:rPr>
+          <w:sz w:val="18"/>
+        </w:rPr>
+        <w:t>`timescale 1ns / 1ps</w:t>
+        <w:br/>
+        <w:br/>
+        <w:t>module fpga_top_pipelined (</w:t>
+        <w:br/>
+        <w:t xml:space="preserve">    input  wire       clk,</w:t>
+        <w:br/>
+        <w:t xml:space="preserve">    input  wire       rst_n,</w:t>
+        <w:br/>
+        <w:t xml:space="preserve">    input  wire       start,</w:t>
+        <w:br/>
+        <w:t xml:space="preserve">    output reg        busy,</w:t>
+        <w:br/>
+        <w:t xml:space="preserve">    output reg        done,</w:t>
+        <w:br/>
+        <w:t xml:space="preserve">    output reg        pass,</w:t>
+        <w:br/>
+        <w:t xml:space="preserve">    output reg [6:0]  checked_count,</w:t>
+        <w:br/>
+        <w:t xml:space="preserve">    output reg [6:0]  error_count,</w:t>
+        <w:br/>
+        <w:t xml:space="preserve">    output reg        last_prediction</w:t>
+        <w:br/>
+        <w:t>);</w:t>
+        <w:br/>
+        <w:t xml:space="preserve">    localparam [1:0] IDLE = 2'd0;</w:t>
+        <w:br/>
+        <w:t xml:space="preserve">    localparam [1:0] SEND = 2'd1;</w:t>
+        <w:br/>
+        <w:t xml:space="preserve">    localparam [1:0] DRAIN = 2'd2;</w:t>
+        <w:br/>
+        <w:br/>
+        <w:t xml:space="preserve">    reg [1:0] state;</w:t>
+        <w:br/>
+        <w:t xml:space="preserve">    reg [5:0] send_index;</w:t>
+        <w:br/>
+        <w:t xml:space="preserve">    reg [5:0] check_index_q0;</w:t>
+        <w:br/>
+        <w:t xml:space="preserve">    reg [5:0] check_index_q1;</w:t>
+        <w:br/>
+        <w:t xml:space="preserve">    reg [39:0] vectors [0:63];</w:t>
+        <w:br/>
+        <w:t xml:space="preserve">    reg [0:0] expected [0:63];</w:t>
+        <w:br/>
+        <w:br/>
+        <w:t xml:space="preserve">    initial begin</w:t>
+        <w:br/>
+        <w:t xml:space="preserve">        $readmemh("tb_inputs_64.mem", vectors);</w:t>
+        <w:br/>
+        <w:t xml:space="preserve">        $readmemh("tb_expected_64.mem", expected);</w:t>
+        <w:br/>
+        <w:t xml:space="preserve">    end</w:t>
+        <w:br/>
+        <w:br/>
+        <w:t xml:space="preserve">    wire [39:0] input_features = vectors[send_index];</w:t>
+        <w:br/>
+        <w:t xml:space="preserve">    wire valid_in = (state == SEND);</w:t>
+        <w:br/>
+        <w:t xml:space="preserve">    wire valid_out;</w:t>
+        <w:br/>
+        <w:t xml:space="preserve">    wire fall_detected;</w:t>
+        <w:br/>
+        <w:t xml:space="preserve">    wire mismatch = (fall_detected != expected[check_index_q1][0]);</w:t>
+        <w:br/>
+        <w:br/>
+        <w:t xml:space="preserve">    bnn_classifier_pipelined classifier (</w:t>
+        <w:br/>
+        <w:t xml:space="preserve">        .clk(clk),</w:t>
+        <w:br/>
+        <w:t xml:space="preserve">        .rst_n(rst_n),</w:t>
+        <w:br/>
+        <w:t xml:space="preserve">        .valid_in(valid_in),</w:t>
+        <w:br/>
+        <w:t xml:space="preserve">        .input_features(input_features),</w:t>
+        <w:br/>
+        <w:t xml:space="preserve">        .valid_out(valid_out),</w:t>
+        <w:br/>
+        <w:t xml:space="preserve">        .fall_detected(fall_detected)</w:t>
+        <w:br/>
+        <w:t xml:space="preserve">    );</w:t>
+        <w:br/>
+        <w:br/>
+        <w:t xml:space="preserve">    always @(posedge clk) begin</w:t>
+        <w:br/>
+        <w:t xml:space="preserve">        if (!rst_n) begin</w:t>
+        <w:br/>
+        <w:t xml:space="preserve">            state &lt;= IDLE;</w:t>
+        <w:br/>
+        <w:t xml:space="preserve">            send_index &lt;= 6'd0;</w:t>
+        <w:br/>
+        <w:t xml:space="preserve">            check_index_q0 &lt;= 6'd0;</w:t>
+        <w:br/>
+        <w:t xml:space="preserve">            check_index_q1 &lt;= 6'd0;</w:t>
+        <w:br/>
+        <w:t xml:space="preserve">            busy &lt;= 1'b0;</w:t>
+        <w:br/>
+        <w:t xml:space="preserve">            done &lt;= 1'b0;</w:t>
+        <w:br/>
+        <w:t xml:space="preserve">            pass &lt;= 1'b0;</w:t>
+        <w:br/>
+        <w:t xml:space="preserve">            checked_count &lt;= 7'd0;</w:t>
+        <w:br/>
+        <w:t xml:space="preserve">            error_count &lt;= 7'd0;</w:t>
+        <w:br/>
+        <w:t xml:space="preserve">            last_prediction &lt;= 1'b0;</w:t>
+        <w:br/>
+        <w:t xml:space="preserve">        end else begin</w:t>
+        <w:br/>
+        <w:t xml:space="preserve">            check_index_q0 &lt;= send_index;</w:t>
+        <w:br/>
+        <w:t xml:space="preserve">            check_index_q1 &lt;= check_index_q0;</w:t>
+        <w:br/>
+        <w:t xml:space="preserve">            case (state)</w:t>
+        <w:br/>
+        <w:t xml:space="preserve">                IDLE: begin</w:t>
+        <w:br/>
+        <w:t xml:space="preserve">                    if (start) begin</w:t>
+        <w:br/>
+        <w:t xml:space="preserve">                        send_index &lt;= 6'd0;</w:t>
+        <w:br/>
+        <w:t xml:space="preserve">                        busy &lt;= 1'b1;</w:t>
+        <w:br/>
+        <w:t xml:space="preserve">                        done &lt;= 1'b0;</w:t>
+        <w:br/>
+        <w:t xml:space="preserve">                        pass &lt;= 1'b0;</w:t>
+        <w:br/>
+        <w:t xml:space="preserve">                        checked_count &lt;= 7'd0;</w:t>
+        <w:br/>
+        <w:t xml:space="preserve">                        error_count &lt;= 7'd0;</w:t>
+        <w:br/>
+        <w:t xml:space="preserve">                        state &lt;= SEND;</w:t>
+        <w:br/>
+        <w:t xml:space="preserve">                    end</w:t>
+        <w:br/>
+        <w:t xml:space="preserve">                end</w:t>
+        <w:br/>
+        <w:t xml:space="preserve">                SEND: begin</w:t>
+        <w:br/>
+        <w:t xml:space="preserve">                    if (send_index == 6'd63)</w:t>
+        <w:br/>
+        <w:t xml:space="preserve">                        state &lt;= DRAIN;</w:t>
+        <w:br/>
+        <w:t xml:space="preserve">                    else</w:t>
+        <w:br/>
+        <w:t xml:space="preserve">                        send_index &lt;= send_index + 6'd1;</w:t>
+        <w:br/>
+        <w:t xml:space="preserve">                end</w:t>
+        <w:br/>
+        <w:t xml:space="preserve">                DRAIN: begin end</w:t>
+        <w:br/>
+        <w:t xml:space="preserve">                default: state &lt;= IDLE;</w:t>
+        <w:br/>
+        <w:t xml:space="preserve">            endcase</w:t>
+        <w:br/>
+        <w:t xml:space="preserve">            if (valid_out &amp;&amp; state != IDLE) begin</w:t>
+        <w:br/>
+        <w:t xml:space="preserve">                checked_count &lt;= checked_count + 7'd1;</w:t>
+        <w:br/>
+        <w:t xml:space="preserve">                last_prediction &lt;= fall_detected;</w:t>
+        <w:br/>
+        <w:t xml:space="preserve">                if (mismatch)</w:t>
+        <w:br/>
+        <w:t xml:space="preserve">                    error_count &lt;= error_count + 7'd1;</w:t>
+        <w:br/>
+        <w:t xml:space="preserve">                if (checked_count == 7'd63) begin</w:t>
+        <w:br/>
+        <w:t xml:space="preserve">                    busy &lt;= 1'b0;</w:t>
+        <w:br/>
+        <w:t xml:space="preserve">                    done &lt;= 1'b1;</w:t>
+        <w:br/>
+        <w:t xml:space="preserve">                    pass &lt;= (error_count == 7'd0) &amp;&amp; !mismatch;</w:t>
+        <w:br/>
+        <w:t xml:space="preserve">                    state &lt;= IDLE;</w:t>
+        <w:br/>
+        <w:t xml:space="preserve">                end</w:t>
+        <w:br/>
+        <w:t xml:space="preserve">            end</w:t>
+        <w:br/>
+        <w:t xml:space="preserve">        end</w:t>
+        <w:br/>
+        <w:t xml:space="preserve">    end</w:t>
+        <w:br/>
+        <w:t>endmodule</w:t>
+      </w:r>
+    </w:p>
+    <w:p>
+      <w:pPr>
+        <w:pStyle w:val="ReportListingCaption"/>
+      </w:pPr>
+      <w:r>
+        <w:t>Листинг В.7 — Верхние модули для сравнения</w:t>
+      </w:r>
+    </w:p>
+    <w:p>
+      <w:pPr>
+        <w:pStyle w:val="ReportCode"/>
+      </w:pPr>
+      <w:r>
+        <w:rPr>
+          <w:sz w:val="18"/>
+        </w:rPr>
+        <w:t>`timescale 1ns / 1ps</w:t>
+        <w:br/>
+        <w:br/>
+        <w:t>module bnn_benchmark_shell #(</w:t>
+        <w:br/>
+        <w:t xml:space="preserve">    parameter PIPELINED = 0</w:t>
+        <w:br/>
+        <w:t>) (</w:t>
+        <w:br/>
+        <w:t xml:space="preserve">    input  wire        clk,</w:t>
+        <w:br/>
+        <w:t xml:space="preserve">    input  wire        rst_n,</w:t>
+        <w:br/>
+        <w:t xml:space="preserve">    input  wire        valid_in,</w:t>
+        <w:br/>
+        <w:t xml:space="preserve">    input  wire [39:0] input_features,</w:t>
+        <w:br/>
+        <w:t xml:space="preserve">    output wire        valid_out,</w:t>
+        <w:br/>
+        <w:t xml:space="preserve">    output wire        fall_detected</w:t>
+        <w:br/>
+        <w:t>);</w:t>
+        <w:br/>
+        <w:t xml:space="preserve">    reg [39:0] input_q;</w:t>
+        <w:br/>
+        <w:t xml:space="preserve">    reg valid_q;</w:t>
+        <w:br/>
+        <w:br/>
+        <w:t xml:space="preserve">    always @(posedge clk) begin</w:t>
+        <w:br/>
+        <w:t xml:space="preserve">        if (!rst_n) begin</w:t>
+        <w:br/>
+        <w:t xml:space="preserve">            input_q &lt;= 40'b0;</w:t>
+        <w:br/>
+        <w:t xml:space="preserve">            valid_q &lt;= 1'b0;</w:t>
+        <w:br/>
+        <w:t xml:space="preserve">        end else begin</w:t>
+        <w:br/>
+        <w:t xml:space="preserve">            input_q &lt;= input_features;</w:t>
+        <w:br/>
+        <w:t xml:space="preserve">            valid_q &lt;= valid_in;</w:t>
+        <w:br/>
+        <w:t xml:space="preserve">        end</w:t>
+        <w:br/>
+        <w:t xml:space="preserve">    end</w:t>
+        <w:br/>
+        <w:br/>
+        <w:t xml:space="preserve">    generate</w:t>
+        <w:br/>
+        <w:t xml:space="preserve">        if (PIPELINED) begin : with_register</w:t>
+        <w:br/>
+        <w:t xml:space="preserve">            bnn_classifier_pipelined classifier (</w:t>
+        <w:br/>
+        <w:t xml:space="preserve">                .clk(clk), .rst_n(rst_n), .valid_in(valid_q),</w:t>
+        <w:br/>
+        <w:t xml:space="preserve">                .input_features(input_q),</w:t>
+        <w:br/>
+        <w:t xml:space="preserve">                .valid_out(valid_out), .fall_detected(fall_detected)</w:t>
+        <w:br/>
+        <w:t xml:space="preserve">            );</w:t>
+        <w:br/>
+        <w:t xml:space="preserve">        end else begin : without_register</w:t>
+        <w:br/>
+        <w:t xml:space="preserve">            bnn_classifier_modular classifier (</w:t>
+        <w:br/>
+        <w:t xml:space="preserve">                .clk(clk), .rst_n(rst_n), .valid_in(valid_q),</w:t>
+        <w:br/>
+        <w:t xml:space="preserve">                .input_features(input_q),</w:t>
+        <w:br/>
+        <w:t xml:space="preserve">                .valid_out(valid_out), .fall_detected(fall_detected)</w:t>
+        <w:br/>
+        <w:t xml:space="preserve">            );</w:t>
+        <w:br/>
+        <w:t xml:space="preserve">        end</w:t>
+        <w:br/>
+        <w:t xml:space="preserve">    endgenerate</w:t>
+        <w:br/>
+        <w:t>endmodule</w:t>
+        <w:br/>
+        <w:br/>
+        <w:t>module bnn_benchmark_baseline (</w:t>
+        <w:br/>
+        <w:t xml:space="preserve">    input wire clk, rst_n, valid_in,</w:t>
+        <w:br/>
+        <w:t xml:space="preserve">    input wire [39:0] input_features,</w:t>
+        <w:br/>
+        <w:t xml:space="preserve">    output wire valid_out, fall_detected</w:t>
+        <w:br/>
+        <w:t>);</w:t>
+        <w:br/>
+        <w:t xml:space="preserve">    bnn_benchmark_shell #(.PIPELINED(0)) shell (</w:t>
+        <w:br/>
+        <w:t xml:space="preserve">        .clk(clk), .rst_n(rst_n), .valid_in(valid_in),</w:t>
+        <w:br/>
+        <w:t xml:space="preserve">        .input_features(input_features),</w:t>
+        <w:br/>
+        <w:t xml:space="preserve">        .valid_out(valid_out), .fall_detected(fall_detected)</w:t>
+        <w:br/>
+        <w:t xml:space="preserve">    );</w:t>
+        <w:br/>
+        <w:t>endmodule</w:t>
+        <w:br/>
+        <w:br/>
+        <w:t>module bnn_benchmark_pipelined (</w:t>
+        <w:br/>
+        <w:t xml:space="preserve">    input wire clk, rst_n, valid_in,</w:t>
+        <w:br/>
+        <w:t xml:space="preserve">    input wire [39:0] input_features,</w:t>
+        <w:br/>
+        <w:t xml:space="preserve">    output wire valid_out, fall_detected</w:t>
+        <w:br/>
+        <w:t>);</w:t>
+        <w:br/>
+        <w:t xml:space="preserve">    bnn_benchmark_shell #(.PIPELINED(1)) shell (</w:t>
+        <w:br/>
+        <w:t xml:space="preserve">        .clk(clk), .rst_n(rst_n), .valid_in(valid_in),</w:t>
+        <w:br/>
+        <w:t xml:space="preserve">        .input_features(input_features),</w:t>
+        <w:br/>
+        <w:t xml:space="preserve">        .valid_out(valid_out), .fall_detected(fall_detected)</w:t>
+        <w:br/>
+        <w:t xml:space="preserve">    );</w:t>
+        <w:br/>
+        <w:t>endmodule</w:t>
       </w:r>
     </w:p>
     <w:sectPr>

</xml_diff>